<commit_message>
agregar crud de proyectos en la api
</commit_message>
<xml_diff>
--- a/docs/Guia-Estructura-Inicial-Suelos-Unificada-v2.docx
+++ b/docs/Guia-Estructura-Inicial-Suelos-Unificada-v2.docx
@@ -30,7 +30,7 @@
     </w:p>
     <w:p>
       <w:r>
-        <w:t>Esta guia resume la estructura del proyecto y explica con mas detalle lo que se hizo en los commits 1, 2 y 3. La idea es que el proceso se vea humano, incremental y justificable frente a otra persona.</w:t>
+        <w:t>Esta guia resume la estructura del proyecto y explica con mas detalle lo que se hizo en los commits 1, 2, 3 y 4. La idea es que el proceso se vea humano, incremental y justificable frente a otra persona.</w:t>
       </w:r>
     </w:p>
     <w:p>
@@ -390,12 +390,67 @@
     </w:p>
     <w:p>
       <w:r>
-        <w:t>Estado actual despues del bloque 3</w:t>
-      </w:r>
-    </w:p>
-    <w:p>
-      <w:r>
-        <w:t>La solucion ya tiene estructura, seguridad base, modelo de datos, contexto de base de datos, semilla inicial y endpoint de autenticacion. Lo siguiente natural es crear los CRUD de las tablas comenzando por Proyecto.</w:t>
+        <w:t>Bloque 4. Commit 4</w:t>
+      </w:r>
+    </w:p>
+    <w:p>
+      <w:r>
+        <w:t>Nombre sugerido: feat: agregar repositorio http base en blazor webassembly</w:t>
+      </w:r>
+    </w:p>
+    <w:p>
+      <w:r>
+        <w:t>En este bloque se preparo el cliente Blazor para consumir la API de forma ordenada y reutilizable.</w:t>
+      </w:r>
+    </w:p>
+    <w:p>
+      <w:r>
+        <w:t>Clases agregadas en Suelos.WEB:</w:t>
+      </w:r>
+    </w:p>
+    <w:p>
+      <w:r>
+        <w:t>- IRepository: contrato con los metodos GetAsync, PostAsync, PutAsync y DeleteAsync.</w:t>
+      </w:r>
+    </w:p>
+    <w:p>
+      <w:r>
+        <w:t>- HttpResponseWrapper: clase de apoyo para manejar respuestas y errores HTTP de forma uniforme.</w:t>
+      </w:r>
+    </w:p>
+    <w:p>
+      <w:r>
+        <w:t>- Repository: implementacion concreta que serializa modelos, consume la API y deserializa respuestas.</w:t>
+      </w:r>
+    </w:p>
+    <w:p>
+      <w:r>
+        <w:t>Cambios de configuracion en Program.cs de WEB:</w:t>
+      </w:r>
+    </w:p>
+    <w:p>
+      <w:r>
+        <w:t>- se ajusto HttpClient para apuntar a la URL base de la API</w:t>
+      </w:r>
+    </w:p>
+    <w:p>
+      <w:r>
+        <w:t>- se registro IRepository con su implementacion Repository</w:t>
+      </w:r>
+    </w:p>
+    <w:p>
+      <w:r>
+        <w:t>La razon de este commit es que antes de construir las pantallas CRUD convenia tener una capa comun de acceso HTTP. Asi no se repite codigo en cada pagina de Blazor y el consumo de la API queda mas ordenado.</w:t>
+      </w:r>
+    </w:p>
+    <w:p>
+      <w:r>
+        <w:t>Estado actual despues del bloque 4</w:t>
+      </w:r>
+    </w:p>
+    <w:p>
+      <w:r>
+        <w:t>La solucion ya tiene estructura, seguridad base, modelo de datos, contexto de base de datos, semilla inicial, endpoint de autenticacion y una capa de repositorio HTTP en el cliente. El siguiente paso natural es crear el CRUD de Proyecto en la API y luego su pagina en Blazor.</w:t>
       </w:r>
     </w:p>
     <w:p>

</xml_diff>

<commit_message>
agregar crud de muestras en la api
</commit_message>
<xml_diff>
--- a/docs/Guia-Estructura-Inicial-Suelos-Unificada-v2.docx
+++ b/docs/Guia-Estructura-Inicial-Suelos-Unificada-v2.docx
@@ -30,7 +30,7 @@
     </w:p>
     <w:p>
       <w:r>
-        <w:t>Esta guia resume la estructura del proyecto y explica con mas detalle lo que se hizo en los commits 1, 2, 3, 4, 5 y 6. La idea es que el proceso se vea humano, incremental y justificable frente a otra persona.</w:t>
+        <w:t>Esta guia resume la estructura del proyecto y explica con mas detalle lo que se hizo en los commits 1, 2, 3, 4, 5, 6 y 7. La idea es que el proceso se vea humano, incremental y justificable frente a otra persona.</w:t>
       </w:r>
     </w:p>
     <w:p>
@@ -80,26 +80,6 @@
     </w:p>
     <w:p>
       <w:r>
-        <w:t>Clases principales definidas</w:t>
-      </w:r>
-    </w:p>
-    <w:p>
-      <w:r>
-        <w:t>Dominio: Proyecto, PuntoMuestreo, Muestra, TipoEnsayo, ParametroEnsayo, EnsayoRealizado y ResultadoParametro.</w:t>
-      </w:r>
-    </w:p>
-    <w:p>
-      <w:r>
-        <w:t>Seguridad: User, LoginDTO y TokenDTO.</w:t>
-      </w:r>
-    </w:p>
-    <w:p>
-      <w:r>
-        <w:t>Infraestructura minima: AppDbContext, IUserHelper, UserHelper, SeedDb y AccountsController.</w:t>
-      </w:r>
-    </w:p>
-    <w:p>
-      <w:r>
         <w:t>Funcionamiento general esperado</w:t>
       </w:r>
     </w:p>
@@ -195,7 +175,22 @@
     </w:p>
     <w:p>
       <w:r>
-        <w:t>En este bloque se agrego el segundo CRUD real del dominio: PuntoMuestreo.</w:t>
+        <w:t>Se creo PuntosMuestreoController con endpoints CRUD, validando que el Proyecto exista y que no se repita el Codigo dentro del mismo Proyecto.</w:t>
+      </w:r>
+    </w:p>
+    <w:p>
+      <w:r>
+        <w:t>Bloque 7. Commit 7</w:t>
+      </w:r>
+    </w:p>
+    <w:p>
+      <w:r>
+        <w:t>Nombre sugerido: feat: agregar crud de muestras en la api</w:t>
+      </w:r>
+    </w:p>
+    <w:p>
+      <w:r>
+        <w:t>En este bloque se agrego el tercer CRUD del flujo principal del dominio: Muestra.</w:t>
       </w:r>
     </w:p>
     <w:p>
@@ -205,7 +200,7 @@
     </w:p>
     <w:p>
       <w:r>
-        <w:t>- PuntosMuestreoController: controlador API protegido con JWT que expone operaciones para listar, consultar por id, crear, editar y eliminar puntos de muestreo.</w:t>
+        <w:t>- MuestrasController: controlador API protegido con JWT que expone operaciones para listar, consultar por id, crear, editar y eliminar muestras.</w:t>
       </w:r>
     </w:p>
     <w:p>
@@ -215,27 +210,27 @@
     </w:p>
     <w:p>
       <w:r>
-        <w:t>- GET /api/puntosmuestreo</w:t>
-      </w:r>
-    </w:p>
-    <w:p>
-      <w:r>
-        <w:t>- GET /api/puntosmuestreo/{id}</w:t>
-      </w:r>
-    </w:p>
-    <w:p>
-      <w:r>
-        <w:t>- POST /api/puntosmuestreo</w:t>
-      </w:r>
-    </w:p>
-    <w:p>
-      <w:r>
-        <w:t>- PUT /api/puntosmuestreo</w:t>
-      </w:r>
-    </w:p>
-    <w:p>
-      <w:r>
-        <w:t>- DELETE /api/puntosmuestreo/{id}</w:t>
+        <w:t>- GET /api/muestras</w:t>
+      </w:r>
+    </w:p>
+    <w:p>
+      <w:r>
+        <w:t>- GET /api/muestras/{id}</w:t>
+      </w:r>
+    </w:p>
+    <w:p>
+      <w:r>
+        <w:t>- POST /api/muestras</w:t>
+      </w:r>
+    </w:p>
+    <w:p>
+      <w:r>
+        <w:t>- PUT /api/muestras</w:t>
+      </w:r>
+    </w:p>
+    <w:p>
+      <w:r>
+        <w:t>- DELETE /api/muestras/{id}</w:t>
       </w:r>
     </w:p>
     <w:p>
@@ -245,32 +240,32 @@
     </w:p>
     <w:p>
       <w:r>
-        <w:t>- se valida que el Proyecto asociado exista antes de crear o editar</w:t>
-      </w:r>
-    </w:p>
-    <w:p>
-      <w:r>
-        <w:t>- se evita repetir el mismo Codigo dentro del mismo Proyecto</w:t>
-      </w:r>
-    </w:p>
-    <w:p>
-      <w:r>
-        <w:t>- las consultas incluyen la relacion con Proyecto para devolver contexto del punto</w:t>
-      </w:r>
-    </w:p>
-    <w:p>
-      <w:r>
-        <w:t>La razon de este commit es seguir el flujo natural del dominio. Despues de Proyecto, la siguiente entidad logica es PuntoMuestreo, porque depende directamente del proyecto y prepara el camino para Muestra.</w:t>
-      </w:r>
-    </w:p>
-    <w:p>
-      <w:r>
-        <w:t>Estado actual despues del bloque 6</w:t>
-      </w:r>
-    </w:p>
-    <w:p>
-      <w:r>
-        <w:t>La solucion ya cuenta con CRUD para Proyecto y PuntoMuestreo en la API, ademas de la base de seguridad, dominio, infraestructura minima y repositorio HTTP en el cliente. El siguiente paso natural es crear el CRUD de Muestra.</w:t>
+        <w:t>- se valida que el PuntoMuestreo asociado exista antes de crear o editar</w:t>
+      </w:r>
+    </w:p>
+    <w:p>
+      <w:r>
+        <w:t>- se evita repetir CodigoMuestra en el sistema</w:t>
+      </w:r>
+    </w:p>
+    <w:p>
+      <w:r>
+        <w:t>- las consultas incluyen la relacion con PuntoMuestreo y Proyecto para devolver contexto completo</w:t>
+      </w:r>
+    </w:p>
+    <w:p>
+      <w:r>
+        <w:t>La razon de este commit es continuar el flujo natural del dominio. Despues de Proyecto y PuntoMuestreo, la siguiente entidad logica es Muestra, porque depende directamente del punto y es la base sobre la que luego se registran los ensayos.</w:t>
+      </w:r>
+    </w:p>
+    <w:p>
+      <w:r>
+        <w:t>Estado actual despues del bloque 7</w:t>
+      </w:r>
+    </w:p>
+    <w:p>
+      <w:r>
+        <w:t>La solucion ya cuenta con CRUD para Proyecto, PuntoMuestreo y Muestra en la API, ademas de la base de seguridad, dominio, infraestructura minima y repositorio HTTP en el cliente. El siguiente paso natural es crear el CRUD de TipoEnsayo.</w:t>
       </w:r>
     </w:p>
     <w:p>

</xml_diff>

<commit_message>
agregar crud de tipos de ensayo en la api
</commit_message>
<xml_diff>
--- a/docs/Guia-Estructura-Inicial-Suelos-Unificada-v2.docx
+++ b/docs/Guia-Estructura-Inicial-Suelos-Unificada-v2.docx
@@ -30,7 +30,7 @@
     </w:p>
     <w:p>
       <w:r>
-        <w:t>Esta guia resume la estructura del proyecto y explica con mas detalle lo que se hizo en los commits 1, 2, 3, 4, 5, 6 y 7. La idea es que el proceso se vea humano, incremental y justificable frente a otra persona.</w:t>
+        <w:t>Esta guia resume la estructura del proyecto y explica con mas detalle lo que se hizo en los commits 1 al 8. La idea es que el proceso se vea humano, incremental y justificable frente a otra persona.</w:t>
       </w:r>
     </w:p>
     <w:p>
@@ -45,37 +45,17 @@
     </w:p>
     <w:p>
       <w:r>
-        <w:t>1. Suelos.API: proyecto ASP.NET Core Web API. Aqui viven Program.cs, los controladores, la configuracion de seguridad, Entity Framework, Identity y la logica de arranque del backend.</w:t>
-      </w:r>
-    </w:p>
-    <w:p>
-      <w:r>
-        <w:t>2. Suelos.Shared: proyecto Class Library. No es un proyecto de consola. Se usa para compartir entidades, DTOs y enums entre la API y el cliente Blazor.</w:t>
-      </w:r>
-    </w:p>
-    <w:p>
-      <w:r>
-        <w:t>3. Suelos.WEB: proyecto Blazor WebAssembly standalone. Es el cliente que corre en el navegador y consume la API.</w:t>
-      </w:r>
-    </w:p>
-    <w:p>
-      <w:r>
-        <w:t>Rol de cada proyecto</w:t>
-      </w:r>
-    </w:p>
-    <w:p>
-      <w:r>
-        <w:t>Suelos.API expone endpoints y se conecta a SQL Server.</w:t>
-      </w:r>
-    </w:p>
-    <w:p>
-      <w:r>
-        <w:t>Suelos.Shared define los tipos comunes para no duplicar clases entre backend y frontend.</w:t>
-      </w:r>
-    </w:p>
-    <w:p>
-      <w:r>
-        <w:t>Suelos.WEB muestra pantallas, hace login, guarda el token y consume los endpoints.</w:t>
+        <w:t>1. Suelos.API: proyecto ASP.NET Core Web API.</w:t>
+      </w:r>
+    </w:p>
+    <w:p>
+      <w:r>
+        <w:t>2. Suelos.Shared: proyecto Class Library.</w:t>
+      </w:r>
+    </w:p>
+    <w:p>
+      <w:r>
+        <w:t>3. Suelos.WEB: proyecto Blazor WebAssembly standalone.</w:t>
       </w:r>
     </w:p>
     <w:p>
@@ -85,7 +65,7 @@
     </w:p>
     <w:p>
       <w:r>
-        <w:t>El usuario inicia sesion con JWT desde el cliente Blazor WebAssembly. Luego administra proyectos, puntos de muestreo, muestras, ensayos y resultados. El flujo central es Proyecto, luego PuntoMuestreo, luego Muestra, luego EnsayoRealizado y finalmente ResultadoParametro.</w:t>
+        <w:t>El usuario inicia sesion con JWT desde el cliente Blazor WebAssembly. Luego administra proyectos, puntos de muestreo, muestras, ensayos y resultados.</w:t>
       </w:r>
     </w:p>
     <w:p>
@@ -95,11 +75,6 @@
     </w:p>
     <w:p>
       <w:r>
-        <w:t>Nombre sugerido: chore: crear solucion base y proyectos iniciales</w:t>
-      </w:r>
-    </w:p>
-    <w:p>
-      <w:r>
         <w:t>Se creo la solucion base en formato SLNX y los tres proyectos vacios: API, Shared y WEB.</w:t>
       </w:r>
     </w:p>
@@ -110,11 +85,6 @@
     </w:p>
     <w:p>
       <w:r>
-        <w:t>Nombre sugerido: feat: agregar base de seguridad y autenticacion cliente</w:t>
-      </w:r>
-    </w:p>
-    <w:p>
-      <w:r>
         <w:t>Se agregaron User, LoginDTO, TokenDTO y UserType en Shared, y en WEB se agregaron ILoginService, AuthenticationProviderJWT y las extensiones de localStorage.</w:t>
       </w:r>
     </w:p>
@@ -125,12 +95,7 @@
     </w:p>
     <w:p>
       <w:r>
-        <w:t>Nombre sugerido: feat: agregar dominio de suelos e infraestructura minima del backend</w:t>
-      </w:r>
-    </w:p>
-    <w:p>
-      <w:r>
-        <w:t>Se agregaron las 7 clases del dominio en Shared y en API se incorporaron AppDbContext, IUserHelper, UserHelper, SeedDb y AccountsController, ademas de la configuracion de Swagger, JWT, Identity y SQL Server.</w:t>
+        <w:t>Se agregaron las 7 clases del dominio en Shared y en API se incorporaron AppDbContext, IUserHelper, UserHelper, SeedDb y AccountsController, ademas de Swagger, JWT, Identity y SQL Server.</w:t>
       </w:r>
     </w:p>
     <w:p>
@@ -140,11 +105,6 @@
     </w:p>
     <w:p>
       <w:r>
-        <w:t>Nombre sugerido: feat: agregar repositorio http base en blazor webassembly</w:t>
-      </w:r>
-    </w:p>
-    <w:p>
-      <w:r>
         <w:t>Se agregaron IRepository, HttpResponseWrapper y Repository en WEB, y se ajusto Program.cs para registrar el repositorio y apuntar HttpClient a la API.</w:t>
       </w:r>
     </w:p>
@@ -155,11 +115,6 @@
     </w:p>
     <w:p>
       <w:r>
-        <w:t>Nombre sugerido: feat: agregar crud de proyectos en la api</w:t>
-      </w:r>
-    </w:p>
-    <w:p>
-      <w:r>
         <w:t>Se creo ProyectosController con endpoints GET, GET por id, POST, PUT y DELETE, ademas de una validacion basica para evitar proyectos repetidos por Nombre y Cliente.</w:t>
       </w:r>
     </w:p>
@@ -170,11 +125,6 @@
     </w:p>
     <w:p>
       <w:r>
-        <w:t>Nombre sugerido: feat: agregar crud de puntos de muestreo en la api</w:t>
-      </w:r>
-    </w:p>
-    <w:p>
-      <w:r>
         <w:t>Se creo PuntosMuestreoController con endpoints CRUD, validando que el Proyecto exista y que no se repita el Codigo dentro del mismo Proyecto.</w:t>
       </w:r>
     </w:p>
@@ -185,12 +135,22 @@
     </w:p>
     <w:p>
       <w:r>
-        <w:t>Nombre sugerido: feat: agregar crud de muestras en la api</w:t>
-      </w:r>
-    </w:p>
-    <w:p>
-      <w:r>
-        <w:t>En este bloque se agrego el tercer CRUD del flujo principal del dominio: Muestra.</w:t>
+        <w:t>Se creo MuestrasController con endpoints CRUD, validando que el PuntoMuestreo exista y que no se repita CodigoMuestra. Las consultas incluyen PuntoMuestreo y Proyecto para devolver contexto completo.</w:t>
+      </w:r>
+    </w:p>
+    <w:p>
+      <w:r>
+        <w:t>Bloque 8. Commit 8</w:t>
+      </w:r>
+    </w:p>
+    <w:p>
+      <w:r>
+        <w:t>Nombre sugerido: feat: agregar crud de tipos de ensayo en la api</w:t>
+      </w:r>
+    </w:p>
+    <w:p>
+      <w:r>
+        <w:t>En este bloque se agrego el CRUD de TipoEnsayo, que es una de las tablas catalogo mas importantes del sistema porque despues sirve como base para ParametroEnsayo y EnsayoRealizado.</w:t>
       </w:r>
     </w:p>
     <w:p>
@@ -200,7 +160,7 @@
     </w:p>
     <w:p>
       <w:r>
-        <w:t>- MuestrasController: controlador API protegido con JWT que expone operaciones para listar, consultar por id, crear, editar y eliminar muestras.</w:t>
+        <w:t>- TiposEnsayoController: controlador API protegido con JWT que expone operaciones para listar, consultar por id, crear, editar y eliminar tipos de ensayo.</w:t>
       </w:r>
     </w:p>
     <w:p>
@@ -210,27 +170,27 @@
     </w:p>
     <w:p>
       <w:r>
-        <w:t>- GET /api/muestras</w:t>
-      </w:r>
-    </w:p>
-    <w:p>
-      <w:r>
-        <w:t>- GET /api/muestras/{id}</w:t>
-      </w:r>
-    </w:p>
-    <w:p>
-      <w:r>
-        <w:t>- POST /api/muestras</w:t>
-      </w:r>
-    </w:p>
-    <w:p>
-      <w:r>
-        <w:t>- PUT /api/muestras</w:t>
-      </w:r>
-    </w:p>
-    <w:p>
-      <w:r>
-        <w:t>- DELETE /api/muestras/{id}</w:t>
+        <w:t>- GET /api/tiposensayo</w:t>
+      </w:r>
+    </w:p>
+    <w:p>
+      <w:r>
+        <w:t>- GET /api/tiposensayo/{id}</w:t>
+      </w:r>
+    </w:p>
+    <w:p>
+      <w:r>
+        <w:t>- POST /api/tiposensayo</w:t>
+      </w:r>
+    </w:p>
+    <w:p>
+      <w:r>
+        <w:t>- PUT /api/tiposensayo</w:t>
+      </w:r>
+    </w:p>
+    <w:p>
+      <w:r>
+        <w:t>- DELETE /api/tiposensayo/{id}</w:t>
       </w:r>
     </w:p>
     <w:p>
@@ -240,32 +200,32 @@
     </w:p>
     <w:p>
       <w:r>
-        <w:t>- se valida que el PuntoMuestreo asociado exista antes de crear o editar</w:t>
-      </w:r>
-    </w:p>
-    <w:p>
-      <w:r>
-        <w:t>- se evita repetir CodigoMuestra en el sistema</w:t>
-      </w:r>
-    </w:p>
-    <w:p>
-      <w:r>
-        <w:t>- las consultas incluyen la relacion con PuntoMuestreo y Proyecto para devolver contexto completo</w:t>
-      </w:r>
-    </w:p>
-    <w:p>
-      <w:r>
-        <w:t>La razon de este commit es continuar el flujo natural del dominio. Despues de Proyecto y PuntoMuestreo, la siguiente entidad logica es Muestra, porque depende directamente del punto y es la base sobre la que luego se registran los ensayos.</w:t>
-      </w:r>
-    </w:p>
-    <w:p>
-      <w:r>
-        <w:t>Estado actual despues del bloque 7</w:t>
-      </w:r>
-    </w:p>
-    <w:p>
-      <w:r>
-        <w:t>La solucion ya cuenta con CRUD para Proyecto, PuntoMuestreo y Muestra en la API, ademas de la base de seguridad, dominio, infraestructura minima y repositorio HTTP en el cliente. El siguiente paso natural es crear el CRUD de TipoEnsayo.</w:t>
+        <w:t>- se evita repetir el Codigo del tipo de ensayo</w:t>
+      </w:r>
+    </w:p>
+    <w:p>
+      <w:r>
+        <w:t>- se evita repetir el Nombre del tipo de ensayo</w:t>
+      </w:r>
+    </w:p>
+    <w:p>
+      <w:r>
+        <w:t>- la consulta general devuelve los tipos ordenados por Nombre</w:t>
+      </w:r>
+    </w:p>
+    <w:p>
+      <w:r>
+        <w:t>La razon de este commit es que despues de tener Proyecto, PuntoMuestreo y Muestra, convenia abrir el lado catalogo del laboratorio. TipoEnsayo es la puerta de entrada para definir ensayos y luego sus parametros.</w:t>
+      </w:r>
+    </w:p>
+    <w:p>
+      <w:r>
+        <w:t>Estado actual despues del bloque 8</w:t>
+      </w:r>
+    </w:p>
+    <w:p>
+      <w:r>
+        <w:t>La solucion ya cuenta con CRUD para Proyecto, PuntoMuestreo, Muestra y TipoEnsayo en la API. El siguiente paso natural es crear el CRUD de ParametroEnsayo.</w:t>
       </w:r>
     </w:p>
     <w:p>

</xml_diff>

<commit_message>
agregar crud de parametros de ensayo en la api
</commit_message>
<xml_diff>
--- a/docs/Guia-Estructura-Inicial-Suelos-Unificada-v2.docx
+++ b/docs/Guia-Estructura-Inicial-Suelos-Unificada-v2.docx
@@ -30,7 +30,7 @@
     </w:p>
     <w:p>
       <w:r>
-        <w:t>Esta guia resume la estructura del proyecto y explica con mas detalle lo que se hizo en los commits 1 al 8. La idea es que el proceso se vea humano, incremental y justificable frente a otra persona.</w:t>
+        <w:t>Esta guia resume la estructura del proyecto y explica con mas detalle lo que se hizo en los commits 1 al 9. La idea es que el proceso se vea humano, incremental y justificable frente a otra persona.</w:t>
       </w:r>
     </w:p>
     <w:p>
@@ -145,12 +145,22 @@
     </w:p>
     <w:p>
       <w:r>
-        <w:t>Nombre sugerido: feat: agregar crud de tipos de ensayo en la api</w:t>
-      </w:r>
-    </w:p>
-    <w:p>
-      <w:r>
-        <w:t>En este bloque se agrego el CRUD de TipoEnsayo, que es una de las tablas catalogo mas importantes del sistema porque despues sirve como base para ParametroEnsayo y EnsayoRealizado.</w:t>
+        <w:t>Se creo TiposEnsayoController con endpoints CRUD, validando que no se repitan Codigo ni Nombre del tipo de ensayo.</w:t>
+      </w:r>
+    </w:p>
+    <w:p>
+      <w:r>
+        <w:t>Bloque 9. Commit 9</w:t>
+      </w:r>
+    </w:p>
+    <w:p>
+      <w:r>
+        <w:t>Nombre sugerido: feat: agregar crud de parametros de ensayo en la api</w:t>
+      </w:r>
+    </w:p>
+    <w:p>
+      <w:r>
+        <w:t>En este bloque se agrego el CRUD de ParametroEnsayo, que depende directamente de TipoEnsayo y representa la definicion de los parametros que se evaluaran en laboratorio.</w:t>
       </w:r>
     </w:p>
     <w:p>
@@ -160,7 +170,7 @@
     </w:p>
     <w:p>
       <w:r>
-        <w:t>- TiposEnsayoController: controlador API protegido con JWT que expone operaciones para listar, consultar por id, crear, editar y eliminar tipos de ensayo.</w:t>
+        <w:t>- ParametrosEnsayoController: controlador API protegido con JWT que expone operaciones para listar, consultar por id, crear, editar y eliminar parametros de ensayo.</w:t>
       </w:r>
     </w:p>
     <w:p>
@@ -170,27 +180,27 @@
     </w:p>
     <w:p>
       <w:r>
-        <w:t>- GET /api/tiposensayo</w:t>
-      </w:r>
-    </w:p>
-    <w:p>
-      <w:r>
-        <w:t>- GET /api/tiposensayo/{id}</w:t>
-      </w:r>
-    </w:p>
-    <w:p>
-      <w:r>
-        <w:t>- POST /api/tiposensayo</w:t>
-      </w:r>
-    </w:p>
-    <w:p>
-      <w:r>
-        <w:t>- PUT /api/tiposensayo</w:t>
-      </w:r>
-    </w:p>
-    <w:p>
-      <w:r>
-        <w:t>- DELETE /api/tiposensayo/{id}</w:t>
+        <w:t>- GET /api/parametrosensayo</w:t>
+      </w:r>
+    </w:p>
+    <w:p>
+      <w:r>
+        <w:t>- GET /api/parametrosensayo/{id}</w:t>
+      </w:r>
+    </w:p>
+    <w:p>
+      <w:r>
+        <w:t>- POST /api/parametrosensayo</w:t>
+      </w:r>
+    </w:p>
+    <w:p>
+      <w:r>
+        <w:t>- PUT /api/parametrosensayo</w:t>
+      </w:r>
+    </w:p>
+    <w:p>
+      <w:r>
+        <w:t>- DELETE /api/parametrosensayo/{id}</w:t>
       </w:r>
     </w:p>
     <w:p>
@@ -200,32 +210,32 @@
     </w:p>
     <w:p>
       <w:r>
-        <w:t>- se evita repetir el Codigo del tipo de ensayo</w:t>
-      </w:r>
-    </w:p>
-    <w:p>
-      <w:r>
-        <w:t>- se evita repetir el Nombre del tipo de ensayo</w:t>
-      </w:r>
-    </w:p>
-    <w:p>
-      <w:r>
-        <w:t>- la consulta general devuelve los tipos ordenados por Nombre</w:t>
-      </w:r>
-    </w:p>
-    <w:p>
-      <w:r>
-        <w:t>La razon de este commit es que despues de tener Proyecto, PuntoMuestreo y Muestra, convenia abrir el lado catalogo del laboratorio. TipoEnsayo es la puerta de entrada para definir ensayos y luego sus parametros.</w:t>
-      </w:r>
-    </w:p>
-    <w:p>
-      <w:r>
-        <w:t>Estado actual despues del bloque 8</w:t>
-      </w:r>
-    </w:p>
-    <w:p>
-      <w:r>
-        <w:t>La solucion ya cuenta con CRUD para Proyecto, PuntoMuestreo, Muestra y TipoEnsayo en la API. El siguiente paso natural es crear el CRUD de ParametroEnsayo.</w:t>
+        <w:t>- se valida que el TipoEnsayo asociado exista antes de crear o editar</w:t>
+      </w:r>
+    </w:p>
+    <w:p>
+      <w:r>
+        <w:t>- se evita repetir el Nombre del parametro dentro del mismo TipoEnsayo</w:t>
+      </w:r>
+    </w:p>
+    <w:p>
+      <w:r>
+        <w:t>- las consultas incluyen la relacion con TipoEnsayo para devolver contexto del parametro</w:t>
+      </w:r>
+    </w:p>
+    <w:p>
+      <w:r>
+        <w:t>La razon de este commit es que despues de tener TipoEnsayo, el siguiente paso natural es definir sus parametros. Sin ParametroEnsayo no se puede construir bien la captura de resultados.</w:t>
+      </w:r>
+    </w:p>
+    <w:p>
+      <w:r>
+        <w:t>Estado actual despues del bloque 9</w:t>
+      </w:r>
+    </w:p>
+    <w:p>
+      <w:r>
+        <w:t>La solucion ya cuenta con CRUD para Proyecto, PuntoMuestreo, Muestra, TipoEnsayo y ParametroEnsayo en la API. El siguiente paso natural es crear el CRUD de EnsayoRealizado.</w:t>
       </w:r>
     </w:p>
     <w:p>

</xml_diff>

<commit_message>
agregar crud de ensayos realizados en la api
</commit_message>
<xml_diff>
--- a/docs/Guia-Estructura-Inicial-Suelos-Unificada-v2.docx
+++ b/docs/Guia-Estructura-Inicial-Suelos-Unificada-v2.docx
@@ -30,7 +30,7 @@
     </w:p>
     <w:p>
       <w:r>
-        <w:t>Esta guia resume la estructura del proyecto y explica con mas detalle lo que se hizo en los commits 1 al 9. La idea es que el proceso se vea humano, incremental y justificable frente a otra persona.</w:t>
+        <w:t>Esta guia resume la estructura del proyecto y explica con mas detalle lo que se hizo en los commits 1 al 10. La idea es que el proceso se vea humano, incremental y justificable frente a otra persona.</w:t>
       </w:r>
     </w:p>
     <w:p>
@@ -155,12 +155,22 @@
     </w:p>
     <w:p>
       <w:r>
-        <w:t>Nombre sugerido: feat: agregar crud de parametros de ensayo en la api</w:t>
-      </w:r>
-    </w:p>
-    <w:p>
-      <w:r>
-        <w:t>En este bloque se agrego el CRUD de ParametroEnsayo, que depende directamente de TipoEnsayo y representa la definicion de los parametros que se evaluaran en laboratorio.</w:t>
+        <w:t>Se creo ParametrosEnsayoController con endpoints CRUD, validando que el TipoEnsayo exista y que no se repita el Nombre del parametro dentro del mismo tipo.</w:t>
+      </w:r>
+    </w:p>
+    <w:p>
+      <w:r>
+        <w:t>Bloque 10. Commit 10</w:t>
+      </w:r>
+    </w:p>
+    <w:p>
+      <w:r>
+        <w:t>Nombre sugerido: feat: agregar crud de ensayos realizados en la api</w:t>
+      </w:r>
+    </w:p>
+    <w:p>
+      <w:r>
+        <w:t>En este bloque se agrego el CRUD de EnsayoRealizado, que une dos partes clave del flujo: la Muestra y el TipoEnsayo. Es la entidad que representa cuando un ensayo concreto ya fue asignado o ejecutado sobre una muestra.</w:t>
       </w:r>
     </w:p>
     <w:p>
@@ -170,7 +180,7 @@
     </w:p>
     <w:p>
       <w:r>
-        <w:t>- ParametrosEnsayoController: controlador API protegido con JWT que expone operaciones para listar, consultar por id, crear, editar y eliminar parametros de ensayo.</w:t>
+        <w:t>- EnsayosRealizadosController: controlador API protegido con JWT que expone operaciones para listar, consultar por id, crear, editar y eliminar ensayos realizados.</w:t>
       </w:r>
     </w:p>
     <w:p>
@@ -180,27 +190,27 @@
     </w:p>
     <w:p>
       <w:r>
-        <w:t>- GET /api/parametrosensayo</w:t>
-      </w:r>
-    </w:p>
-    <w:p>
-      <w:r>
-        <w:t>- GET /api/parametrosensayo/{id}</w:t>
-      </w:r>
-    </w:p>
-    <w:p>
-      <w:r>
-        <w:t>- POST /api/parametrosensayo</w:t>
-      </w:r>
-    </w:p>
-    <w:p>
-      <w:r>
-        <w:t>- PUT /api/parametrosensayo</w:t>
-      </w:r>
-    </w:p>
-    <w:p>
-      <w:r>
-        <w:t>- DELETE /api/parametrosensayo/{id}</w:t>
+        <w:t>- GET /api/ensayosrealizados</w:t>
+      </w:r>
+    </w:p>
+    <w:p>
+      <w:r>
+        <w:t>- GET /api/ensayosrealizados/{id}</w:t>
+      </w:r>
+    </w:p>
+    <w:p>
+      <w:r>
+        <w:t>- POST /api/ensayosrealizados</w:t>
+      </w:r>
+    </w:p>
+    <w:p>
+      <w:r>
+        <w:t>- PUT /api/ensayosrealizados</w:t>
+      </w:r>
+    </w:p>
+    <w:p>
+      <w:r>
+        <w:t>- DELETE /api/ensayosrealizados/{id}</w:t>
       </w:r>
     </w:p>
     <w:p>
@@ -210,32 +220,37 @@
     </w:p>
     <w:p>
       <w:r>
+        <w:t>- se valida que la Muestra asociada exista antes de crear o editar</w:t>
+      </w:r>
+    </w:p>
+    <w:p>
+      <w:r>
         <w:t>- se valida que el TipoEnsayo asociado exista antes de crear o editar</w:t>
       </w:r>
     </w:p>
     <w:p>
       <w:r>
-        <w:t>- se evita repetir el Nombre del parametro dentro del mismo TipoEnsayo</w:t>
-      </w:r>
-    </w:p>
-    <w:p>
-      <w:r>
-        <w:t>- las consultas incluyen la relacion con TipoEnsayo para devolver contexto del parametro</w:t>
-      </w:r>
-    </w:p>
-    <w:p>
-      <w:r>
-        <w:t>La razon de este commit es que despues de tener TipoEnsayo, el siguiente paso natural es definir sus parametros. Sin ParametroEnsayo no se puede construir bien la captura de resultados.</w:t>
-      </w:r>
-    </w:p>
-    <w:p>
-      <w:r>
-        <w:t>Estado actual despues del bloque 9</w:t>
-      </w:r>
-    </w:p>
-    <w:p>
-      <w:r>
-        <w:t>La solucion ya cuenta con CRUD para Proyecto, PuntoMuestreo, Muestra, TipoEnsayo y ParametroEnsayo en la API. El siguiente paso natural es crear el CRUD de EnsayoRealizado.</w:t>
+        <w:t>- se evita repetir la misma combinacion de Muestra y TipoEnsayo</w:t>
+      </w:r>
+    </w:p>
+    <w:p>
+      <w:r>
+        <w:t>- las consultas incluyen la relacion con Muestra, PuntoMuestreo y TipoEnsayo para devolver mas contexto</w:t>
+      </w:r>
+    </w:p>
+    <w:p>
+      <w:r>
+        <w:t>La razon de este commit es que despues de tener muestras y catalogos de ensayos, ya era posible registrar la ejecucion real de un ensayo. Este bloque conecta la parte administrativa con la parte tecnica del laboratorio.</w:t>
+      </w:r>
+    </w:p>
+    <w:p>
+      <w:r>
+        <w:t>Estado actual despues del bloque 10</w:t>
+      </w:r>
+    </w:p>
+    <w:p>
+      <w:r>
+        <w:t>La solucion ya cuenta con CRUD para Proyecto, PuntoMuestreo, Muestra, TipoEnsayo, ParametroEnsayo y EnsayoRealizado en la API. El siguiente paso natural es crear el CRUD de ResultadoParametro.</w:t>
       </w:r>
     </w:p>
     <w:p>

</xml_diff>

<commit_message>
agregar crud de resultados de parametros en la api
</commit_message>
<xml_diff>
--- a/docs/Guia-Estructura-Inicial-Suelos-Unificada-v2.docx
+++ b/docs/Guia-Estructura-Inicial-Suelos-Unificada-v2.docx
@@ -30,7 +30,7 @@
     </w:p>
     <w:p>
       <w:r>
-        <w:t>Esta guia resume la estructura del proyecto y explica con mas detalle lo que se hizo en los commits 1 al 10. La idea es que el proceso se vea humano, incremental y justificable frente a otra persona.</w:t>
+        <w:t>Esta guia resume la estructura del proyecto y explica con mas detalle lo que se hizo en los commits 1 al 11. La idea es que el proceso se vea humano, incremental y justificable frente a otra persona.</w:t>
       </w:r>
     </w:p>
     <w:p>
@@ -165,12 +165,22 @@
     </w:p>
     <w:p>
       <w:r>
-        <w:t>Nombre sugerido: feat: agregar crud de ensayos realizados en la api</w:t>
-      </w:r>
-    </w:p>
-    <w:p>
-      <w:r>
-        <w:t>En este bloque se agrego el CRUD de EnsayoRealizado, que une dos partes clave del flujo: la Muestra y el TipoEnsayo. Es la entidad que representa cuando un ensayo concreto ya fue asignado o ejecutado sobre una muestra.</w:t>
+        <w:t>Se creo EnsayosRealizadosController con endpoints CRUD, validando que la Muestra y el TipoEnsayo existan y que no se repita la combinacion de ambos.</w:t>
+      </w:r>
+    </w:p>
+    <w:p>
+      <w:r>
+        <w:t>Bloque 11. Commit 11</w:t>
+      </w:r>
+    </w:p>
+    <w:p>
+      <w:r>
+        <w:t>Nombre sugerido: feat: agregar crud de resultados de parametros en la api</w:t>
+      </w:r>
+    </w:p>
+    <w:p>
+      <w:r>
+        <w:t>En este bloque se agrego el CRUD de ResultadoParametro, que completa el recorrido principal del dominio porque permite capturar el valor final de cada parametro medido dentro de un ensayo.</w:t>
       </w:r>
     </w:p>
     <w:p>
@@ -180,7 +190,7 @@
     </w:p>
     <w:p>
       <w:r>
-        <w:t>- EnsayosRealizadosController: controlador API protegido con JWT que expone operaciones para listar, consultar por id, crear, editar y eliminar ensayos realizados.</w:t>
+        <w:t>- ResultadosController: controlador API protegido con JWT que expone operaciones para listar, consultar por id, crear, editar y eliminar resultados de parametros.</w:t>
       </w:r>
     </w:p>
     <w:p>
@@ -190,27 +200,27 @@
     </w:p>
     <w:p>
       <w:r>
-        <w:t>- GET /api/ensayosrealizados</w:t>
-      </w:r>
-    </w:p>
-    <w:p>
-      <w:r>
-        <w:t>- GET /api/ensayosrealizados/{id}</w:t>
-      </w:r>
-    </w:p>
-    <w:p>
-      <w:r>
-        <w:t>- POST /api/ensayosrealizados</w:t>
-      </w:r>
-    </w:p>
-    <w:p>
-      <w:r>
-        <w:t>- PUT /api/ensayosrealizados</w:t>
-      </w:r>
-    </w:p>
-    <w:p>
-      <w:r>
-        <w:t>- DELETE /api/ensayosrealizados/{id}</w:t>
+        <w:t>- GET /api/resultados</w:t>
+      </w:r>
+    </w:p>
+    <w:p>
+      <w:r>
+        <w:t>- GET /api/resultados/{id}</w:t>
+      </w:r>
+    </w:p>
+    <w:p>
+      <w:r>
+        <w:t>- POST /api/resultados</w:t>
+      </w:r>
+    </w:p>
+    <w:p>
+      <w:r>
+        <w:t>- PUT /api/resultados</w:t>
+      </w:r>
+    </w:p>
+    <w:p>
+      <w:r>
+        <w:t>- DELETE /api/resultados/{id}</w:t>
       </w:r>
     </w:p>
     <w:p>
@@ -220,37 +230,37 @@
     </w:p>
     <w:p>
       <w:r>
-        <w:t>- se valida que la Muestra asociada exista antes de crear o editar</w:t>
-      </w:r>
-    </w:p>
-    <w:p>
-      <w:r>
-        <w:t>- se valida que el TipoEnsayo asociado exista antes de crear o editar</w:t>
-      </w:r>
-    </w:p>
-    <w:p>
-      <w:r>
-        <w:t>- se evita repetir la misma combinacion de Muestra y TipoEnsayo</w:t>
-      </w:r>
-    </w:p>
-    <w:p>
-      <w:r>
-        <w:t>- las consultas incluyen la relacion con Muestra, PuntoMuestreo y TipoEnsayo para devolver mas contexto</w:t>
-      </w:r>
-    </w:p>
-    <w:p>
-      <w:r>
-        <w:t>La razon de este commit es que despues de tener muestras y catalogos de ensayos, ya era posible registrar la ejecucion real de un ensayo. Este bloque conecta la parte administrativa con la parte tecnica del laboratorio.</w:t>
-      </w:r>
-    </w:p>
-    <w:p>
-      <w:r>
-        <w:t>Estado actual despues del bloque 10</w:t>
-      </w:r>
-    </w:p>
-    <w:p>
-      <w:r>
-        <w:t>La solucion ya cuenta con CRUD para Proyecto, PuntoMuestreo, Muestra, TipoEnsayo, ParametroEnsayo y EnsayoRealizado en la API. El siguiente paso natural es crear el CRUD de ResultadoParametro.</w:t>
+        <w:t>- se valida que el EnsayoRealizado asociado exista antes de crear o editar</w:t>
+      </w:r>
+    </w:p>
+    <w:p>
+      <w:r>
+        <w:t>- se valida que el ParametroEnsayo asociado exista antes de crear o editar</w:t>
+      </w:r>
+    </w:p>
+    <w:p>
+      <w:r>
+        <w:t>- se evita repetir la combinacion de EnsayoRealizado y ParametroEnsayo</w:t>
+      </w:r>
+    </w:p>
+    <w:p>
+      <w:r>
+        <w:t>- las consultas incluyen EnsayoRealizado, Muestra, ParametroEnsayo y TipoEnsayo para devolver contexto completo</w:t>
+      </w:r>
+    </w:p>
+    <w:p>
+      <w:r>
+        <w:t>La razon de este commit es cerrar el flujo tecnico del laboratorio. Con este bloque ya se puede registrar el resultado final de un ensayo en terminos de parametro y valor.</w:t>
+      </w:r>
+    </w:p>
+    <w:p>
+      <w:r>
+        <w:t>Estado actual despues del bloque 11</w:t>
+      </w:r>
+    </w:p>
+    <w:p>
+      <w:r>
+        <w:t>La solucion ya cuenta con CRUD base para las 7 tablas principales del dominio en la API. El siguiente paso natural es empezar las paginas de Blazor para consumir estos endpoints o agregar pantallas para Proyecto primero.</w:t>
       </w:r>
     </w:p>
     <w:p>

</xml_diff>

<commit_message>
agregar creacion de proyectos en blazor
</commit_message>
<xml_diff>
--- a/docs/Guia-Estructura-Inicial-Suelos-Unificada-v2.docx
+++ b/docs/Guia-Estructura-Inicial-Suelos-Unificada-v2.docx
@@ -30,7 +30,7 @@
     </w:p>
     <w:p>
       <w:r>
-        <w:t>Esta guia resume la estructura del proyecto y explica con mas detalle lo que se hizo en los commits 1 al 12. La idea es que el proceso se vea humano, incremental y justificable frente a otra persona.</w:t>
+        <w:t>Esta guia resume la estructura del proyecto y explica con mas detalle lo que se hizo en los commits 1 al 13. La idea es que el proceso se vea humano, incremental y justificable frente a otra persona.</w:t>
       </w:r>
     </w:p>
     <w:p>
@@ -70,27 +70,27 @@
     </w:p>
     <w:p>
       <w:r>
-        <w:t>Bloque 1 al 11</w:t>
+        <w:t>Bloque 1 al 12</w:t>
       </w:r>
     </w:p>
     <w:p>
       <w:r>
-        <w:t>En estos bloques se construyo la solucion base, la seguridad, la infraestructura minima del backend, el repositorio HTTP del cliente y los CRUD de las 7 tablas principales del dominio.</w:t>
+        <w:t>En estos bloques se construyo la solucion base, la seguridad, la infraestructura minima del backend, el repositorio HTTP del cliente, los CRUD de las 7 tablas principales y la primera pantalla de listado de proyectos en Blazor.</w:t>
       </w:r>
     </w:p>
     <w:p>
       <w:r>
-        <w:t>Bloque 12. Commit 12</w:t>
+        <w:t>Bloque 13. Commit 13</w:t>
       </w:r>
     </w:p>
     <w:p>
       <w:r>
-        <w:t>Nombre sugerido: feat: agregar listado de proyectos en blazor</w:t>
+        <w:t>Nombre sugerido: feat: agregar creacion de proyectos en blazor</w:t>
       </w:r>
     </w:p>
     <w:p>
       <w:r>
-        <w:t>En este bloque se dio el primer paso real del frontend funcional: consumir la API desde Blazor para mostrar el listado de proyectos.</w:t>
+        <w:t>En este bloque se dio el siguiente paso natural del frontend: pasar de solo listar proyectos a permitir crear nuevos proyectos desde una pantalla en Blazor.</w:t>
       </w:r>
     </w:p>
     <w:p>
@@ -100,12 +100,17 @@
     </w:p>
     <w:p>
       <w:r>
-        <w:t>- Pages/Proyectos.razor: nueva pagina que usa IRepository para consultar api/proyectos y mostrar la respuesta en una tabla.</w:t>
+        <w:t>- Pages/Proyectos.razor: se agrego el boton Nuevo proyecto para navegar a la pantalla de alta.</w:t>
       </w:r>
     </w:p>
     <w:p>
       <w:r>
-        <w:t>- Layout/NavMenu.razor: se agrego el enlace de navegacion hacia la pagina de proyectos.</w:t>
+        <w:t>- Pages/ProyectoCrear.razor: nueva pagina con formulario usando EditForm, DataAnnotationsValidator e IRepository para enviar el POST a api/proyectos.</w:t>
+      </w:r>
+    </w:p>
+    <w:p>
+      <w:r>
+        <w:t>- _Imports.razor: se agregaron usings de entidades compartidas y del repositorio para simplificar las paginas.</w:t>
       </w:r>
     </w:p>
     <w:p>
@@ -115,37 +120,42 @@
     </w:p>
     <w:p>
       <w:r>
-        <w:t>- muestra un mensaje de carga mientras consulta la API</w:t>
+        <w:t>- formulario con campos Nombre, Cliente, Ubicacion y Estado</w:t>
       </w:r>
     </w:p>
     <w:p>
       <w:r>
-        <w:t>- muestra un error si falla la consulta</w:t>
+        <w:t>- validacion basada en data annotations del modelo Proyecto</w:t>
       </w:r>
     </w:p>
     <w:p>
       <w:r>
-        <w:t>- muestra un mensaje vacio si no hay proyectos</w:t>
+        <w:t>- envio del formulario con POST a la API</w:t>
       </w:r>
     </w:p>
     <w:p>
       <w:r>
-        <w:t>- muestra una tabla con Nombre, Cliente, Ubicacion y Estado cuando la respuesta es correcta</w:t>
+        <w:t>- redireccion al listado de proyectos si la creacion es exitosa</w:t>
       </w:r>
     </w:p>
     <w:p>
       <w:r>
-        <w:t>La razon de este commit es empezar el frontend por el caso mas simple y mas visible: leer datos del backend y renderizarlos. Es un paso muy humano porque valida la conexion entre WEB y API antes de intentar formularios de crear o editar.</w:t>
+        <w:t>- mensaje de error si la API responde con fallo</w:t>
       </w:r>
     </w:p>
     <w:p>
       <w:r>
-        <w:t>Estado actual despues del bloque 12</w:t>
+        <w:t>La razon de este commit es avanzar de forma humana: primero se comprobo que el frontend podia leer desde la API y luego se habilito la primera operacion de escritura. Asi se valida paso a paso la comunicacion entre UI y backend.</w:t>
       </w:r>
     </w:p>
     <w:p>
       <w:r>
-        <w:t>La aplicacion ya tiene backend CRUD de las tablas principales y una primera pantalla funcional en Blazor para listar proyectos. El siguiente paso natural es agregar el formulario o pantalla de creacion/edicion de proyectos.</w:t>
+        <w:t>Estado actual despues del bloque 13</w:t>
+      </w:r>
+    </w:p>
+    <w:p>
+      <w:r>
+        <w:t>La aplicacion ya puede listar y crear proyectos desde Blazor WebAssembly. El siguiente paso natural es agregar la edicion de proyectos o continuar con la UI de PuntoMuestreo.</w:t>
       </w:r>
     </w:p>
     <w:p>

</xml_diff>

<commit_message>
agregar listado de puntos de muestreo en blazor
</commit_message>
<xml_diff>
--- a/docs/Guia-Estructura-Inicial-Suelos-Unificada-v2.docx
+++ b/docs/Guia-Estructura-Inicial-Suelos-Unificada-v2.docx
@@ -233,6 +233,76 @@
         <w:t>La aplicacion ya permite listar, crear, editar y eliminar proyectos desde Blazor WebAssembly. El siguiente paso natural es empezar el listado de PuntoMuestreo.</w:t>
       </w:r>
     </w:p>
+    <w:p>
+      <w:r>
+        <w:t>Bloque 16. Commit 16</w:t>
+      </w:r>
+    </w:p>
+    <w:p>
+      <w:r>
+        <w:t>Nombre sugerido: feat: agregar listado de puntos de muestreo en blazor</w:t>
+      </w:r>
+    </w:p>
+    <w:p>
+      <w:r>
+        <w:t>En este bloque se inicio el segundo modulo del frontend creando la pantalla de listado para PuntoMuestreo.</w:t>
+      </w:r>
+    </w:p>
+    <w:p>
+      <w:r>
+        <w:t>Archivos modificados en Suelos.WEB:</w:t>
+      </w:r>
+    </w:p>
+    <w:p>
+      <w:r>
+        <w:t>- Pages/PuntosMuestreo.razor: nueva pagina que consulta api/puntosmuestreo y muestra una tabla con Codigo, Proyecto, Sector, Descripcion y coordenadas.</w:t>
+      </w:r>
+    </w:p>
+    <w:p>
+      <w:r>
+        <w:t>- Layout/NavMenu.razor: se agrego el enlace Puntos de muestreo para poder navegar a la nueva pantalla desde el menu principal.</w:t>
+      </w:r>
+    </w:p>
+    <w:p>
+      <w:r>
+        <w:t>Comportamiento agregado:</w:t>
+      </w:r>
+    </w:p>
+    <w:p>
+      <w:r>
+        <w:t>- al entrar a /puntos-muestreo la pagina consulta la API usando IRepository</w:t>
+      </w:r>
+    </w:p>
+    <w:p>
+      <w:r>
+        <w:t>- mientras carga, se muestra un mensaje temporal</w:t>
+      </w:r>
+    </w:p>
+    <w:p>
+      <w:r>
+        <w:t>- si la API devuelve error, se muestra el mensaje recibido</w:t>
+      </w:r>
+    </w:p>
+    <w:p>
+      <w:r>
+        <w:t>- si hay datos, se presenta una tabla simple orientada a lectura</w:t>
+      </w:r>
+    </w:p>
+    <w:p>
+      <w:r>
+        <w:t>La razon de este commit es empezar el siguiente modulo con el mismo patron usado en Proyecto: primero listado, luego creacion, despues edicion y finalmente eliminacion. Asi el historial sigue viendose gradual y facil de defender.</w:t>
+      </w:r>
+    </w:p>
+    <w:p>
+      <w:r>
+        <w:t>Estado actual despues del bloque 16</w:t>
+      </w:r>
+    </w:p>
+    <w:p>
+      <w:r>
+        <w:t>La aplicacion ya tiene el CRUD completo de Proyecto en el frontend y el listado inicial de PuntoMuestreo. El siguiente paso natural es crear la pantalla para registrar puntos de muestreo.</w:t>
+      </w:r>
+    </w:p>
     <w:sectPr>
       <w:pgSz w:w="12240" w:h="15840"/>
       <w:pgMar w:top="1440" w:right="1440" w:bottom="1440" w:left="1440" w:header="708" w:footer="708" w:gutter="0"/>

</xml_diff>

<commit_message>
agregar creacion de puntos de muestreo en blazor
</commit_message>
<xml_diff>
--- a/docs/Guia-Estructura-Inicial-Suelos-Unificada-v2.docx
+++ b/docs/Guia-Estructura-Inicial-Suelos-Unificada-v2.docx
@@ -303,6 +303,86 @@
         <w:t>La aplicacion ya tiene el CRUD completo de Proyecto en el frontend y el listado inicial de PuntoMuestreo. El siguiente paso natural es crear la pantalla para registrar puntos de muestreo.</w:t>
       </w:r>
     </w:p>
+    <w:p>
+      <w:r>
+        <w:t>Bloque 17. Commit 17</w:t>
+      </w:r>
+    </w:p>
+    <w:p>
+      <w:r>
+        <w:t>Nombre sugerido: feat: agregar creacion de puntos de muestreo en blazor</w:t>
+      </w:r>
+    </w:p>
+    <w:p>
+      <w:r>
+        <w:t>En este bloque se agrego la pantalla para registrar nuevos puntos de muestreo desde el frontend.</w:t>
+      </w:r>
+    </w:p>
+    <w:p>
+      <w:r>
+        <w:t>Archivos modificados en Suelos.WEB:</w:t>
+      </w:r>
+    </w:p>
+    <w:p>
+      <w:r>
+        <w:t>- Pages/PuntoMuestreoCrear.razor: nueva pagina con formulario de alta y carga previa de proyectos.</w:t>
+      </w:r>
+    </w:p>
+    <w:p>
+      <w:r>
+        <w:t>- Pages/PuntosMuestreo.razor: se agrego el boton Nuevo punto de muestreo para navegar al formulario.</w:t>
+      </w:r>
+    </w:p>
+    <w:p>
+      <w:r>
+        <w:t>Comportamiento agregado:</w:t>
+      </w:r>
+    </w:p>
+    <w:p>
+      <w:r>
+        <w:t>- al entrar a /puntos-muestreo/crear la pagina consulta api/proyectos para llenar el selector de proyecto</w:t>
+      </w:r>
+    </w:p>
+    <w:p>
+      <w:r>
+        <w:t>- el formulario permite registrar Codigo, Sector, Descripcion y coordenadas</w:t>
+      </w:r>
+    </w:p>
+    <w:p>
+      <w:r>
+        <w:t>- antes de guardar se valida que el usuario seleccione un proyecto</w:t>
+      </w:r>
+    </w:p>
+    <w:p>
+      <w:r>
+        <w:t>- al guardar se ejecuta POST sobre api/puntosmuestreo</w:t>
+      </w:r>
+    </w:p>
+    <w:p>
+      <w:r>
+        <w:t>- si la operacion es correcta, el usuario vuelve al listado</w:t>
+      </w:r>
+    </w:p>
+    <w:p>
+      <w:r>
+        <w:t>- si ocurre un error, el mensaje de la API se muestra en pantalla</w:t>
+      </w:r>
+    </w:p>
+    <w:p>
+      <w:r>
+        <w:t>La razon de este commit es seguir el mismo patron del modulo Proyecto: primero listado y luego creacion. Ademas, este paso deja clara la relacion entre PuntoMuestreo y Proyecto, que es una de las dependencias importantes del dominio.</w:t>
+      </w:r>
+    </w:p>
+    <w:p>
+      <w:r>
+        <w:t>Estado actual despues del bloque 17</w:t>
+      </w:r>
+    </w:p>
+    <w:p>
+      <w:r>
+        <w:t>La aplicacion ya permite listar y crear puntos de muestreo desde Blazor. El siguiente paso natural es agregar la edicion de puntos de muestreo.</w:t>
+      </w:r>
+    </w:p>
     <w:sectPr>
       <w:pgSz w:w="12240" w:h="15840"/>
       <w:pgMar w:top="1440" w:right="1440" w:bottom="1440" w:left="1440" w:header="708" w:footer="708" w:gutter="0"/>

</xml_diff>

<commit_message>
agregar edicion de puntos de muestreo en blazor
</commit_message>
<xml_diff>
--- a/docs/Guia-Estructura-Inicial-Suelos-Unificada-v2.docx
+++ b/docs/Guia-Estructura-Inicial-Suelos-Unificada-v2.docx
@@ -383,6 +383,86 @@
         <w:t>La aplicacion ya permite listar y crear puntos de muestreo desde Blazor. El siguiente paso natural es agregar la edicion de puntos de muestreo.</w:t>
       </w:r>
     </w:p>
+    <w:p>
+      <w:r>
+        <w:t>Bloque 18. Commit 18</w:t>
+      </w:r>
+    </w:p>
+    <w:p>
+      <w:r>
+        <w:t>Nombre sugerido: feat: agregar edicion de puntos de muestreo en blazor</w:t>
+      </w:r>
+    </w:p>
+    <w:p>
+      <w:r>
+        <w:t>En este bloque se agrego la pantalla de edicion para PuntoMuestreo, manteniendo el mismo patron usado antes en Proyecto.</w:t>
+      </w:r>
+    </w:p>
+    <w:p>
+      <w:r>
+        <w:t>Archivos modificados en Suelos.WEB:</w:t>
+      </w:r>
+    </w:p>
+    <w:p>
+      <w:r>
+        <w:t>- Pages/PuntoMuestreoEditar.razor: nueva pagina que carga los proyectos, consulta el punto por id y permite guardar cambios mediante PUT.</w:t>
+      </w:r>
+    </w:p>
+    <w:p>
+      <w:r>
+        <w:t>- Pages/PuntosMuestreo.razor: se agrego la columna Acciones y un boton Editar por cada fila.</w:t>
+      </w:r>
+    </w:p>
+    <w:p>
+      <w:r>
+        <w:t>Comportamiento agregado:</w:t>
+      </w:r>
+    </w:p>
+    <w:p>
+      <w:r>
+        <w:t>- al pulsar Editar desde el listado, el usuario navega a /puntos-muestreo/editar/{id}</w:t>
+      </w:r>
+    </w:p>
+    <w:p>
+      <w:r>
+        <w:t>- la pagina consulta primero api/proyectos para llenar el selector y despues api/puntosmuestreo/{id} para cargar el registro</w:t>
+      </w:r>
+    </w:p>
+    <w:p>
+      <w:r>
+        <w:t>- el formulario permite cambiar proyecto, codigo, sector, descripcion y coordenadas</w:t>
+      </w:r>
+    </w:p>
+    <w:p>
+      <w:r>
+        <w:t>- al guardar se ejecuta PUT sobre api/puntosmuestreo</w:t>
+      </w:r>
+    </w:p>
+    <w:p>
+      <w:r>
+        <w:t>- si la operacion es correcta, el usuario vuelve al listado</w:t>
+      </w:r>
+    </w:p>
+    <w:p>
+      <w:r>
+        <w:t>- si ocurre un error, el mensaje queda visible en pantalla</w:t>
+      </w:r>
+    </w:p>
+    <w:p>
+      <w:r>
+        <w:t>La razon de este commit es completar el flujo intermedio de PuntoMuestreo antes de pasar a la eliminacion. Esto mantiene una progresion ordenada y muy parecida a la forma en que una persona construiria el modulo paso a paso.</w:t>
+      </w:r>
+    </w:p>
+    <w:p>
+      <w:r>
+        <w:t>Estado actual despues del bloque 18</w:t>
+      </w:r>
+    </w:p>
+    <w:p>
+      <w:r>
+        <w:t>La aplicacion ya permite listar, crear y editar puntos de muestreo desde Blazor. El siguiente paso natural es agregar la eliminacion de puntos de muestreo.</w:t>
+      </w:r>
+    </w:p>
     <w:sectPr>
       <w:pgSz w:w="12240" w:h="15840"/>
       <w:pgMar w:top="1440" w:right="1440" w:bottom="1440" w:left="1440" w:header="708" w:footer="708" w:gutter="0"/>

</xml_diff>

<commit_message>
agregar eliminacion de puntos de muestreo en blazor
</commit_message>
<xml_diff>
--- a/docs/Guia-Estructura-Inicial-Suelos-Unificada-v2.docx
+++ b/docs/Guia-Estructura-Inicial-Suelos-Unificada-v2.docx
@@ -463,6 +463,71 @@
         <w:t>La aplicacion ya permite listar, crear y editar puntos de muestreo desde Blazor. El siguiente paso natural es agregar la eliminacion de puntos de muestreo.</w:t>
       </w:r>
     </w:p>
+    <w:p>
+      <w:r>
+        <w:t>Bloque 19. Commit 19</w:t>
+      </w:r>
+    </w:p>
+    <w:p>
+      <w:r>
+        <w:t>Nombre sugerido: feat: agregar eliminacion de puntos de muestreo en blazor</w:t>
+      </w:r>
+    </w:p>
+    <w:p>
+      <w:r>
+        <w:t>En este bloque se completo el CRUD de PuntoMuestreo en el frontend agregando la opcion de eliminar desde la tabla de listado.</w:t>
+      </w:r>
+    </w:p>
+    <w:p>
+      <w:r>
+        <w:t>Archivo modificado en Suelos.WEB:</w:t>
+      </w:r>
+    </w:p>
+    <w:p>
+      <w:r>
+        <w:t>- Pages/PuntosMuestreo.razor: se inyecto IJSRuntime, se agrego el boton Eliminar, se extrajo la carga a un metodo reutilizable y se implemento el metodo EliminarPuntoMuestreoAsync.</w:t>
+      </w:r>
+    </w:p>
+    <w:p>
+      <w:r>
+        <w:t>Comportamiento agregado:</w:t>
+      </w:r>
+    </w:p>
+    <w:p>
+      <w:r>
+        <w:t>- al pulsar Eliminar, el navegador pide confirmacion antes de borrar el punto</w:t>
+      </w:r>
+    </w:p>
+    <w:p>
+      <w:r>
+        <w:t>- si el usuario confirma, se ejecuta DELETE sobre api/puntosmuestreo/{id}</w:t>
+      </w:r>
+    </w:p>
+    <w:p>
+      <w:r>
+        <w:t>- si la API responde correctamente, la tabla se recarga consultando otra vez los datos</w:t>
+      </w:r>
+    </w:p>
+    <w:p>
+      <w:r>
+        <w:t>- si ocurre un error, el mensaje se muestra en pantalla</w:t>
+      </w:r>
+    </w:p>
+    <w:p>
+      <w:r>
+        <w:t>La razon de este commit es dejar completo el segundo modulo visible de la aplicacion antes de pasar a Muestra. Asi el historial sigue una secuencia logica: listado, creacion, edicion y eliminacion.</w:t>
+      </w:r>
+    </w:p>
+    <w:p>
+      <w:r>
+        <w:t>Estado actual despues del bloque 19</w:t>
+      </w:r>
+    </w:p>
+    <w:p>
+      <w:r>
+        <w:t>La aplicacion ya tiene completos en el frontend los modulos de Proyecto y PuntoMuestreo. El siguiente paso natural es comenzar el listado de Muestra.</w:t>
+      </w:r>
+    </w:p>
     <w:sectPr>
       <w:pgSz w:w="12240" w:h="15840"/>
       <w:pgMar w:top="1440" w:right="1440" w:bottom="1440" w:left="1440" w:header="708" w:footer="708" w:gutter="0"/>

</xml_diff>

<commit_message>
agregar listado de muestras en blazor
</commit_message>
<xml_diff>
--- a/docs/Guia-Estructura-Inicial-Suelos-Unificada-v2.docx
+++ b/docs/Guia-Estructura-Inicial-Suelos-Unificada-v2.docx
@@ -528,6 +528,76 @@
         <w:t>La aplicacion ya tiene completos en el frontend los modulos de Proyecto y PuntoMuestreo. El siguiente paso natural es comenzar el listado de Muestra.</w:t>
       </w:r>
     </w:p>
+    <w:p>
+      <w:r>
+        <w:t>Bloque 20. Commit 20</w:t>
+      </w:r>
+    </w:p>
+    <w:p>
+      <w:r>
+        <w:t>Nombre sugerido: feat: agregar listado de muestras en blazor</w:t>
+      </w:r>
+    </w:p>
+    <w:p>
+      <w:r>
+        <w:t>En este bloque se inicio el modulo de Muestra en el frontend con una pantalla de listado simple orientada a consulta.</w:t>
+      </w:r>
+    </w:p>
+    <w:p>
+      <w:r>
+        <w:t>Archivos modificados en Suelos.WEB:</w:t>
+      </w:r>
+    </w:p>
+    <w:p>
+      <w:r>
+        <w:t>- Pages/Muestras.razor: nueva pagina que consulta api/muestras y muestra una tabla con codigo, proyecto, punto, fechas y estado.</w:t>
+      </w:r>
+    </w:p>
+    <w:p>
+      <w:r>
+        <w:t>- Layout/NavMenu.razor: se agrego el enlace Muestras para poder entrar al nuevo modulo desde el menu.</w:t>
+      </w:r>
+    </w:p>
+    <w:p>
+      <w:r>
+        <w:t>Comportamiento agregado:</w:t>
+      </w:r>
+    </w:p>
+    <w:p>
+      <w:r>
+        <w:t>- al entrar a /muestras la pagina consulta la API usando IRepository</w:t>
+      </w:r>
+    </w:p>
+    <w:p>
+      <w:r>
+        <w:t>- mientras carga, se muestra un mensaje temporal</w:t>
+      </w:r>
+    </w:p>
+    <w:p>
+      <w:r>
+        <w:t>- si hay error, se presenta el mensaje devuelto por la API</w:t>
+      </w:r>
+    </w:p>
+    <w:p>
+      <w:r>
+        <w:t>- si hay datos, se listan con informacion suficiente para identificar la muestra y su ubicacion dentro del proyecto</w:t>
+      </w:r>
+    </w:p>
+    <w:p>
+      <w:r>
+        <w:t>La razon de este commit es abrir el tercer modulo visible siguiendo exactamente el mismo patron de construccion usado antes: primero el listado y despues las operaciones de alta, edicion y eliminacion.</w:t>
+      </w:r>
+    </w:p>
+    <w:p>
+      <w:r>
+        <w:t>Estado actual despues del bloque 20</w:t>
+      </w:r>
+    </w:p>
+    <w:p>
+      <w:r>
+        <w:t>La aplicacion ya tiene completos los modulos de Proyecto y PuntoMuestreo en el frontend, y ahora cuenta con el listado inicial de Muestra. El siguiente paso natural es crear la pantalla para registrar muestras.</w:t>
+      </w:r>
+    </w:p>
     <w:sectPr>
       <w:pgSz w:w="12240" w:h="15840"/>
       <w:pgMar w:top="1440" w:right="1440" w:bottom="1440" w:left="1440" w:header="708" w:footer="708" w:gutter="0"/>

</xml_diff>

<commit_message>
agregar creacion de muestras en blazor
</commit_message>
<xml_diff>
--- a/docs/Guia-Estructura-Inicial-Suelos-Unificada-v2.docx
+++ b/docs/Guia-Estructura-Inicial-Suelos-Unificada-v2.docx
@@ -598,6 +598,86 @@
         <w:t>La aplicacion ya tiene completos los modulos de Proyecto y PuntoMuestreo en el frontend, y ahora cuenta con el listado inicial de Muestra. El siguiente paso natural es crear la pantalla para registrar muestras.</w:t>
       </w:r>
     </w:p>
+    <w:p>
+      <w:r>
+        <w:t>Bloque 21. Commit 21</w:t>
+      </w:r>
+    </w:p>
+    <w:p>
+      <w:r>
+        <w:t>Nombre sugerido: feat: agregar creacion de muestras en blazor</w:t>
+      </w:r>
+    </w:p>
+    <w:p>
+      <w:r>
+        <w:t>En este bloque se agrego la pantalla para registrar nuevas muestras desde el frontend.</w:t>
+      </w:r>
+    </w:p>
+    <w:p>
+      <w:r>
+        <w:t>Archivos modificados en Suelos.WEB:</w:t>
+      </w:r>
+    </w:p>
+    <w:p>
+      <w:r>
+        <w:t>- Pages/MuestraCrear.razor: nueva pagina con formulario de alta y carga previa de puntos de muestreo.</w:t>
+      </w:r>
+    </w:p>
+    <w:p>
+      <w:r>
+        <w:t>- Pages/Muestras.razor: se agrego el boton Nueva muestra para navegar al formulario.</w:t>
+      </w:r>
+    </w:p>
+    <w:p>
+      <w:r>
+        <w:t>Comportamiento agregado:</w:t>
+      </w:r>
+    </w:p>
+    <w:p>
+      <w:r>
+        <w:t>- al entrar a /muestras/crear la pagina consulta api/puntosmuestreo para llenar el selector de relacion</w:t>
+      </w:r>
+    </w:p>
+    <w:p>
+      <w:r>
+        <w:t>- el formulario permite registrar codigo, fechas, profundidades, tipo, estado y observaciones</w:t>
+      </w:r>
+    </w:p>
+    <w:p>
+      <w:r>
+        <w:t>- antes de guardar se valida que el usuario seleccione un punto de muestreo</w:t>
+      </w:r>
+    </w:p>
+    <w:p>
+      <w:r>
+        <w:t>- al guardar se ejecuta POST sobre api/muestras</w:t>
+      </w:r>
+    </w:p>
+    <w:p>
+      <w:r>
+        <w:t>- si la operacion es correcta, el usuario vuelve al listado</w:t>
+      </w:r>
+    </w:p>
+    <w:p>
+      <w:r>
+        <w:t>- si hay error, el mensaje de la API queda visible en pantalla</w:t>
+      </w:r>
+    </w:p>
+    <w:p>
+      <w:r>
+        <w:t>La razon de este commit es seguir el mismo patron que ya se uso en los modulos anteriores y dejar clara la dependencia entre Muestra y PuntoMuestreo desde el formulario.</w:t>
+      </w:r>
+    </w:p>
+    <w:p>
+      <w:r>
+        <w:t>Estado actual despues del bloque 21</w:t>
+      </w:r>
+    </w:p>
+    <w:p>
+      <w:r>
+        <w:t>La aplicacion ya permite listar y crear muestras desde Blazor. El siguiente paso natural es agregar la edicion de muestras.</w:t>
+      </w:r>
+    </w:p>
     <w:sectPr>
       <w:pgSz w:w="12240" w:h="15840"/>
       <w:pgMar w:top="1440" w:right="1440" w:bottom="1440" w:left="1440" w:header="708" w:footer="708" w:gutter="0"/>

</xml_diff>

<commit_message>
agregar edicion de muestras en blazor
</commit_message>
<xml_diff>
--- a/docs/Guia-Estructura-Inicial-Suelos-Unificada-v2.docx
+++ b/docs/Guia-Estructura-Inicial-Suelos-Unificada-v2.docx
@@ -678,6 +678,86 @@
         <w:t>La aplicacion ya permite listar y crear muestras desde Blazor. El siguiente paso natural es agregar la edicion de muestras.</w:t>
       </w:r>
     </w:p>
+    <w:p>
+      <w:r>
+        <w:t>Bloque 22. Commit 22</w:t>
+      </w:r>
+    </w:p>
+    <w:p>
+      <w:r>
+        <w:t>Nombre sugerido: feat: agregar edicion de muestras en blazor</w:t>
+      </w:r>
+    </w:p>
+    <w:p>
+      <w:r>
+        <w:t>En este bloque se agrego la pantalla de edicion para Muestra, siguiendo el mismo flujo usado en los modulos anteriores.</w:t>
+      </w:r>
+    </w:p>
+    <w:p>
+      <w:r>
+        <w:t>Archivos modificados en Suelos.WEB:</w:t>
+      </w:r>
+    </w:p>
+    <w:p>
+      <w:r>
+        <w:t>- Pages/MuestraEditar.razor: nueva pagina que carga los puntos de muestreo, consulta la muestra por id y permite guardar cambios mediante PUT.</w:t>
+      </w:r>
+    </w:p>
+    <w:p>
+      <w:r>
+        <w:t>- Pages/Muestras.razor: se agrego la columna Acciones y un boton Editar por cada fila.</w:t>
+      </w:r>
+    </w:p>
+    <w:p>
+      <w:r>
+        <w:t>Comportamiento agregado:</w:t>
+      </w:r>
+    </w:p>
+    <w:p>
+      <w:r>
+        <w:t>- al pulsar Editar desde el listado, el usuario navega a /muestras/editar/{id}</w:t>
+      </w:r>
+    </w:p>
+    <w:p>
+      <w:r>
+        <w:t>- la pagina consulta primero api/puntosmuestreo para llenar el selector y despues api/muestras/{id} para cargar el registro</w:t>
+      </w:r>
+    </w:p>
+    <w:p>
+      <w:r>
+        <w:t>- el formulario permite cambiar punto, codigo, fechas, profundidades, tipo, estado y observaciones</w:t>
+      </w:r>
+    </w:p>
+    <w:p>
+      <w:r>
+        <w:t>- al guardar se ejecuta PUT sobre api/muestras</w:t>
+      </w:r>
+    </w:p>
+    <w:p>
+      <w:r>
+        <w:t>- si la operacion es correcta, el usuario vuelve al listado</w:t>
+      </w:r>
+    </w:p>
+    <w:p>
+      <w:r>
+        <w:t>- si ocurre un error, el mensaje queda visible en pantalla</w:t>
+      </w:r>
+    </w:p>
+    <w:p>
+      <w:r>
+        <w:t>La razon de este commit es completar el flujo intermedio de Muestra antes de pasar a la eliminacion, manteniendo una progresion ordenada y muy humana en el historial.</w:t>
+      </w:r>
+    </w:p>
+    <w:p>
+      <w:r>
+        <w:t>Estado actual despues del bloque 22</w:t>
+      </w:r>
+    </w:p>
+    <w:p>
+      <w:r>
+        <w:t>La aplicacion ya permite listar, crear y editar muestras desde Blazor. El siguiente paso natural es agregar la eliminacion de muestras.</w:t>
+      </w:r>
+    </w:p>
     <w:sectPr>
       <w:pgSz w:w="12240" w:h="15840"/>
       <w:pgMar w:top="1440" w:right="1440" w:bottom="1440" w:left="1440" w:header="708" w:footer="708" w:gutter="0"/>

</xml_diff>

<commit_message>
agregar eliminacion de muestras en blazor
</commit_message>
<xml_diff>
--- a/docs/Guia-Estructura-Inicial-Suelos-Unificada-v2.docx
+++ b/docs/Guia-Estructura-Inicial-Suelos-Unificada-v2.docx
@@ -758,6 +758,71 @@
         <w:t>La aplicacion ya permite listar, crear y editar muestras desde Blazor. El siguiente paso natural es agregar la eliminacion de muestras.</w:t>
       </w:r>
     </w:p>
+    <w:p>
+      <w:r>
+        <w:t>Bloque 23. Commit 23</w:t>
+      </w:r>
+    </w:p>
+    <w:p>
+      <w:r>
+        <w:t>Nombre sugerido: feat: agregar eliminacion de muestras en blazor</w:t>
+      </w:r>
+    </w:p>
+    <w:p>
+      <w:r>
+        <w:t>En este bloque se completo el CRUD de Muestra en el frontend agregando la opcion de eliminar desde la tabla principal.</w:t>
+      </w:r>
+    </w:p>
+    <w:p>
+      <w:r>
+        <w:t>Archivo modificado en Suelos.WEB:</w:t>
+      </w:r>
+    </w:p>
+    <w:p>
+      <w:r>
+        <w:t>- Pages/Muestras.razor: se inyecto IJSRuntime, se agrego el boton Eliminar, se extrajo la carga a un metodo reutilizable y se implemento el metodo EliminarMuestraAsync.</w:t>
+      </w:r>
+    </w:p>
+    <w:p>
+      <w:r>
+        <w:t>Comportamiento agregado:</w:t>
+      </w:r>
+    </w:p>
+    <w:p>
+      <w:r>
+        <w:t>- al pulsar Eliminar, el navegador pide confirmacion antes de borrar la muestra</w:t>
+      </w:r>
+    </w:p>
+    <w:p>
+      <w:r>
+        <w:t>- si el usuario confirma, se ejecuta DELETE sobre api/muestras/{id}</w:t>
+      </w:r>
+    </w:p>
+    <w:p>
+      <w:r>
+        <w:t>- si la API responde correctamente, la tabla se recarga consultando otra vez los datos</w:t>
+      </w:r>
+    </w:p>
+    <w:p>
+      <w:r>
+        <w:t>- si ocurre un error, el mensaje se muestra en pantalla</w:t>
+      </w:r>
+    </w:p>
+    <w:p>
+      <w:r>
+        <w:t>La razon de este commit es dejar completo el tercer modulo visible del sistema antes de pasar a catalogos como TipoEnsayo y ParametroEnsayo. Esto mantiene la construccion ordenada por bloques funcionales.</w:t>
+      </w:r>
+    </w:p>
+    <w:p>
+      <w:r>
+        <w:t>Estado actual despues del bloque 23</w:t>
+      </w:r>
+    </w:p>
+    <w:p>
+      <w:r>
+        <w:t>La aplicacion ya tiene completos en el frontend los modulos de Proyecto, PuntoMuestreo y Muestra. El siguiente paso natural es comenzar el listado de TipoEnsayo.</w:t>
+      </w:r>
+    </w:p>
     <w:sectPr>
       <w:pgSz w:w="12240" w:h="15840"/>
       <w:pgMar w:top="1440" w:right="1440" w:bottom="1440" w:left="1440" w:header="708" w:footer="708" w:gutter="0"/>

</xml_diff>

<commit_message>
agregar listado de tipos de ensayo en blazor
</commit_message>
<xml_diff>
--- a/docs/Guia-Estructura-Inicial-Suelos-Unificada-v2.docx
+++ b/docs/Guia-Estructura-Inicial-Suelos-Unificada-v2.docx
@@ -823,6 +823,76 @@
         <w:t>La aplicacion ya tiene completos en el frontend los modulos de Proyecto, PuntoMuestreo y Muestra. El siguiente paso natural es comenzar el listado de TipoEnsayo.</w:t>
       </w:r>
     </w:p>
+    <w:p>
+      <w:r>
+        <w:t>Bloque 24. Commit 24</w:t>
+      </w:r>
+    </w:p>
+    <w:p>
+      <w:r>
+        <w:t>Nombre sugerido: feat: agregar listado de tipos de ensayo en blazor</w:t>
+      </w:r>
+    </w:p>
+    <w:p>
+      <w:r>
+        <w:t>En este bloque se inicio el modulo catalogo de TipoEnsayo en el frontend con una pantalla de listado sencilla.</w:t>
+      </w:r>
+    </w:p>
+    <w:p>
+      <w:r>
+        <w:t>Archivos modificados en Suelos.WEB:</w:t>
+      </w:r>
+    </w:p>
+    <w:p>
+      <w:r>
+        <w:t>- Pages/TiposEnsayo.razor: nueva pagina que consulta api/tiposensayo y muestra una tabla con codigo, nombre, descripcion y estado activo.</w:t>
+      </w:r>
+    </w:p>
+    <w:p>
+      <w:r>
+        <w:t>- Layout/NavMenu.razor: se agrego el enlace Tipos de ensayo para poder navegar al nuevo catalogo desde el menu.</w:t>
+      </w:r>
+    </w:p>
+    <w:p>
+      <w:r>
+        <w:t>Comportamiento agregado:</w:t>
+      </w:r>
+    </w:p>
+    <w:p>
+      <w:r>
+        <w:t>- al entrar a /tipos-ensayo la pagina consulta la API usando IRepository</w:t>
+      </w:r>
+    </w:p>
+    <w:p>
+      <w:r>
+        <w:t>- mientras carga, se muestra un mensaje temporal</w:t>
+      </w:r>
+    </w:p>
+    <w:p>
+      <w:r>
+        <w:t>- si hay error, se presenta el mensaje devuelto por la API</w:t>
+      </w:r>
+    </w:p>
+    <w:p>
+      <w:r>
+        <w:t>- si hay datos, se listan en una tabla orientada a mantenimiento de catalogos</w:t>
+      </w:r>
+    </w:p>
+    <w:p>
+      <w:r>
+        <w:t>La razon de este commit es comenzar los modulos catalogo despues de cerrar los modulos operativos principales. Esto hace que el historial se vea ordenado por prioridad funcional.</w:t>
+      </w:r>
+    </w:p>
+    <w:p>
+      <w:r>
+        <w:t>Estado actual despues del bloque 24</w:t>
+      </w:r>
+    </w:p>
+    <w:p>
+      <w:r>
+        <w:t>La aplicacion ya tiene completos los modulos de Proyecto, PuntoMuestreo y Muestra, y ahora cuenta con el listado inicial de TipoEnsayo. El siguiente paso natural es agregar creacion y edicion de tipos de ensayo.</w:t>
+      </w:r>
+    </w:p>
     <w:sectPr>
       <w:pgSz w:w="12240" w:h="15840"/>
       <w:pgMar w:top="1440" w:right="1440" w:bottom="1440" w:left="1440" w:header="708" w:footer="708" w:gutter="0"/>

</xml_diff>

<commit_message>
agregar creacion y edicion de tipos de ensayo en blazor
</commit_message>
<xml_diff>
--- a/docs/Guia-Estructura-Inicial-Suelos-Unificada-v2.docx
+++ b/docs/Guia-Estructura-Inicial-Suelos-Unificada-v2.docx
@@ -893,6 +893,86 @@
         <w:t>La aplicacion ya tiene completos los modulos de Proyecto, PuntoMuestreo y Muestra, y ahora cuenta con el listado inicial de TipoEnsayo. El siguiente paso natural es agregar creacion y edicion de tipos de ensayo.</w:t>
       </w:r>
     </w:p>
+    <w:p>
+      <w:r>
+        <w:t>Bloque 25. Commit 25</w:t>
+      </w:r>
+    </w:p>
+    <w:p>
+      <w:r>
+        <w:t>Nombre sugerido: feat: agregar creacion y edicion de tipos de ensayo en blazor</w:t>
+      </w:r>
+    </w:p>
+    <w:p>
+      <w:r>
+        <w:t>En este bloque se agregaron las pantallas de alta y edicion para TipoEnsayo dentro del modulo catalogo.</w:t>
+      </w:r>
+    </w:p>
+    <w:p>
+      <w:r>
+        <w:t>Archivos modificados en Suelos.WEB:</w:t>
+      </w:r>
+    </w:p>
+    <w:p>
+      <w:r>
+        <w:t>- Pages/TipoEnsayoCrear.razor: nueva pagina con formulario de alta.</w:t>
+      </w:r>
+    </w:p>
+    <w:p>
+      <w:r>
+        <w:t>- Pages/TipoEnsayoEditar.razor: nueva pagina que consulta el tipo por id y permite guardar cambios mediante PUT.</w:t>
+      </w:r>
+    </w:p>
+    <w:p>
+      <w:r>
+        <w:t>- Pages/TiposEnsayo.razor: se agrego el boton Nuevo tipo de ensayo, la columna Acciones y el boton Editar.</w:t>
+      </w:r>
+    </w:p>
+    <w:p>
+      <w:r>
+        <w:t>Comportamiento agregado:</w:t>
+      </w:r>
+    </w:p>
+    <w:p>
+      <w:r>
+        <w:t>- el formulario de alta permite registrar codigo, nombre, descripcion y estado activo</w:t>
+      </w:r>
+    </w:p>
+    <w:p>
+      <w:r>
+        <w:t>- al guardar desde crear, se ejecuta POST sobre api/tiposensayo</w:t>
+      </w:r>
+    </w:p>
+    <w:p>
+      <w:r>
+        <w:t>- al pulsar Editar desde el listado, el usuario navega a /tipos-ensayo/editar/{id}</w:t>
+      </w:r>
+    </w:p>
+    <w:p>
+      <w:r>
+        <w:t>- la pagina de edicion consulta api/tiposensayo/{id} y luego permite guardar cambios con PUT</w:t>
+      </w:r>
+    </w:p>
+    <w:p>
+      <w:r>
+        <w:t>- si las operaciones salen bien, el usuario vuelve al listado; si fallan, el error queda visible</w:t>
+      </w:r>
+    </w:p>
+    <w:p>
+      <w:r>
+        <w:t>La razon de este commit es que TipoEnsayo es un catalogo pequeno y tenia sentido resolver creacion y edicion en un mismo bloque, sin partir demasiado el historial de forma artificial.</w:t>
+      </w:r>
+    </w:p>
+    <w:p>
+      <w:r>
+        <w:t>Estado actual despues del bloque 25</w:t>
+      </w:r>
+    </w:p>
+    <w:p>
+      <w:r>
+        <w:t>La aplicacion ya permite listar, crear y editar tipos de ensayo desde Blazor. El siguiente paso natural es comenzar el listado de ParametroEnsayo.</w:t>
+      </w:r>
+    </w:p>
     <w:sectPr>
       <w:pgSz w:w="12240" w:h="15840"/>
       <w:pgMar w:top="1440" w:right="1440" w:bottom="1440" w:left="1440" w:header="708" w:footer="708" w:gutter="0"/>

</xml_diff>

<commit_message>
agregar listado de parametros de ensayo en blazor
</commit_message>
<xml_diff>
--- a/docs/Guia-Estructura-Inicial-Suelos-Unificada-v2.docx
+++ b/docs/Guia-Estructura-Inicial-Suelos-Unificada-v2.docx
@@ -973,6 +973,76 @@
         <w:t>La aplicacion ya permite listar, crear y editar tipos de ensayo desde Blazor. El siguiente paso natural es comenzar el listado de ParametroEnsayo.</w:t>
       </w:r>
     </w:p>
+    <w:p>
+      <w:r>
+        <w:t>Bloque 26. Commit 26</w:t>
+      </w:r>
+    </w:p>
+    <w:p>
+      <w:r>
+        <w:t>Nombre sugerido: feat: agregar listado de parametros de ensayo en blazor</w:t>
+      </w:r>
+    </w:p>
+    <w:p>
+      <w:r>
+        <w:t>En este bloque se inicio el modulo catalogo de ParametroEnsayo en el frontend con una pantalla de listado.</w:t>
+      </w:r>
+    </w:p>
+    <w:p>
+      <w:r>
+        <w:t>Archivos modificados en Suelos.WEB:</w:t>
+      </w:r>
+    </w:p>
+    <w:p>
+      <w:r>
+        <w:t>- Pages/ParametrosEnsayo.razor: nueva pagina que consulta api/parametrosensayo y muestra una tabla con la informacion principal del parametro.</w:t>
+      </w:r>
+    </w:p>
+    <w:p>
+      <w:r>
+        <w:t>- Layout/NavMenu.razor: se agrego el enlace Parametros de ensayo para poder navegar al nuevo catalogo.</w:t>
+      </w:r>
+    </w:p>
+    <w:p>
+      <w:r>
+        <w:t>Comportamiento agregado:</w:t>
+      </w:r>
+    </w:p>
+    <w:p>
+      <w:r>
+        <w:t>- al entrar a /parametros-ensayo la pagina consulta la API usando IRepository</w:t>
+      </w:r>
+    </w:p>
+    <w:p>
+      <w:r>
+        <w:t>- mientras carga, se muestra un mensaje temporal</w:t>
+      </w:r>
+    </w:p>
+    <w:p>
+      <w:r>
+        <w:t>- si hay error, se presenta el mensaje devuelto por la API</w:t>
+      </w:r>
+    </w:p>
+    <w:p>
+      <w:r>
+        <w:t>- si hay datos, se listan mostrando a que tipo de ensayo pertenece cada parametro y sus rangos de referencia</w:t>
+      </w:r>
+    </w:p>
+    <w:p>
+      <w:r>
+        <w:t>La razon de este commit es continuar con los catalogos tecnicos del laboratorio despues de cerrar el modulo de TipoEnsayo. Este orden ayuda a entender primero el tipo y luego los parametros que dependen de el.</w:t>
+      </w:r>
+    </w:p>
+    <w:p>
+      <w:r>
+        <w:t>Estado actual despues del bloque 26</w:t>
+      </w:r>
+    </w:p>
+    <w:p>
+      <w:r>
+        <w:t>La aplicacion ya cuenta con el listado inicial de ParametroEnsayo. El siguiente paso natural es agregar creacion y edicion de parametros de ensayo.</w:t>
+      </w:r>
+    </w:p>
     <w:sectPr>
       <w:pgSz w:w="12240" w:h="15840"/>
       <w:pgMar w:top="1440" w:right="1440" w:bottom="1440" w:left="1440" w:header="708" w:footer="708" w:gutter="0"/>

</xml_diff>

<commit_message>
agregar creacion y edicion de parametros de ensayo en blazor
</commit_message>
<xml_diff>
--- a/docs/Guia-Estructura-Inicial-Suelos-Unificada-v2.docx
+++ b/docs/Guia-Estructura-Inicial-Suelos-Unificada-v2.docx
@@ -1043,6 +1043,91 @@
         <w:t>La aplicacion ya cuenta con el listado inicial de ParametroEnsayo. El siguiente paso natural es agregar creacion y edicion de parametros de ensayo.</w:t>
       </w:r>
     </w:p>
+    <w:p>
+      <w:r>
+        <w:t>Bloque 27. Commit 27</w:t>
+      </w:r>
+    </w:p>
+    <w:p>
+      <w:r>
+        <w:t>Nombre sugerido: feat: agregar creacion y edicion de parametros de ensayo en blazor</w:t>
+      </w:r>
+    </w:p>
+    <w:p>
+      <w:r>
+        <w:t>En este bloque se agregaron las pantallas de alta y edicion para ParametroEnsayo dentro del modulo catalogo tecnico.</w:t>
+      </w:r>
+    </w:p>
+    <w:p>
+      <w:r>
+        <w:t>Archivos modificados en Suelos.WEB:</w:t>
+      </w:r>
+    </w:p>
+    <w:p>
+      <w:r>
+        <w:t>- Pages/ParametroEnsayoCrear.razor: nueva pagina con formulario de alta y selector de tipo de ensayo.</w:t>
+      </w:r>
+    </w:p>
+    <w:p>
+      <w:r>
+        <w:t>- Pages/ParametroEnsayoEditar.razor: nueva pagina que carga los tipos de ensayo, consulta el parametro por id y permite guardar cambios mediante PUT.</w:t>
+      </w:r>
+    </w:p>
+    <w:p>
+      <w:r>
+        <w:t>- Pages/ParametrosEnsayo.razor: se agrego el boton Nuevo parametro de ensayo, la columna Acciones y el boton Editar.</w:t>
+      </w:r>
+    </w:p>
+    <w:p>
+      <w:r>
+        <w:t>Comportamiento agregado:</w:t>
+      </w:r>
+    </w:p>
+    <w:p>
+      <w:r>
+        <w:t>- el formulario de alta permite seleccionar el tipo de ensayo y registrar nombre, unidad, banderas y rangos referenciales</w:t>
+      </w:r>
+    </w:p>
+    <w:p>
+      <w:r>
+        <w:t>- al guardar desde crear, se ejecuta POST sobre api/parametrosensayo</w:t>
+      </w:r>
+    </w:p>
+    <w:p>
+      <w:r>
+        <w:t>- al pulsar Editar desde el listado, el usuario navega a /parametros-ensayo/editar/{id}</w:t>
+      </w:r>
+    </w:p>
+    <w:p>
+      <w:r>
+        <w:t>- la pagina de edicion consulta primero api/tiposensayo y luego api/parametrosensayo/{id} para cargar el registro</w:t>
+      </w:r>
+    </w:p>
+    <w:p>
+      <w:r>
+        <w:t>- al guardar cambios se ejecuta PUT sobre api/parametrosensayo</w:t>
+      </w:r>
+    </w:p>
+    <w:p>
+      <w:r>
+        <w:t>- si las operaciones salen bien, el usuario vuelve al listado; si fallan, el error queda visible</w:t>
+      </w:r>
+    </w:p>
+    <w:p>
+      <w:r>
+        <w:t>La razon de este commit es que ParametroEnsayo, igual que TipoEnsayo, es un catalogo pequeno y tenia sentido resolver creacion y edicion en un mismo bloque sin fragmentar demasiado el avance.</w:t>
+      </w:r>
+    </w:p>
+    <w:p>
+      <w:r>
+        <w:t>Estado actual despues del bloque 27</w:t>
+      </w:r>
+    </w:p>
+    <w:p>
+      <w:r>
+        <w:t>La aplicacion ya permite listar, crear y editar parametros de ensayo desde Blazor. El siguiente paso natural es comenzar el listado de EnsayoRealizado.</w:t>
+      </w:r>
+    </w:p>
     <w:sectPr>
       <w:pgSz w:w="12240" w:h="15840"/>
       <w:pgMar w:top="1440" w:right="1440" w:bottom="1440" w:left="1440" w:header="708" w:footer="708" w:gutter="0"/>

</xml_diff>

<commit_message>
agregar listado de ensayos realizados en blazor
</commit_message>
<xml_diff>
--- a/docs/Guia-Estructura-Inicial-Suelos-Unificada-v2.docx
+++ b/docs/Guia-Estructura-Inicial-Suelos-Unificada-v2.docx
@@ -1128,6 +1128,76 @@
         <w:t>La aplicacion ya permite listar, crear y editar parametros de ensayo desde Blazor. El siguiente paso natural es comenzar el listado de EnsayoRealizado.</w:t>
       </w:r>
     </w:p>
+    <w:p>
+      <w:r>
+        <w:t>Bloque 28. Commit 28</w:t>
+      </w:r>
+    </w:p>
+    <w:p>
+      <w:r>
+        <w:t>Nombre sugerido: feat: agregar listado de ensayos realizados en blazor</w:t>
+      </w:r>
+    </w:p>
+    <w:p>
+      <w:r>
+        <w:t>En este bloque se inicio el modulo de EnsayoRealizado en el frontend con una pantalla de listado enfocada en seguimiento del proceso del laboratorio.</w:t>
+      </w:r>
+    </w:p>
+    <w:p>
+      <w:r>
+        <w:t>Archivos modificados en Suelos.WEB:</w:t>
+      </w:r>
+    </w:p>
+    <w:p>
+      <w:r>
+        <w:t>- Pages/EnsayosRealizados.razor: nueva pagina que consulta api/ensayosrealizados y muestra una tabla con muestra, punto, tipo de ensayo, fechas, responsable y estado.</w:t>
+      </w:r>
+    </w:p>
+    <w:p>
+      <w:r>
+        <w:t>- Layout/NavMenu.razor: se agrego el enlace Ensayos realizados para poder navegar al nuevo modulo desde el menu.</w:t>
+      </w:r>
+    </w:p>
+    <w:p>
+      <w:r>
+        <w:t>Comportamiento agregado:</w:t>
+      </w:r>
+    </w:p>
+    <w:p>
+      <w:r>
+        <w:t>- al entrar a /ensayos-realizados la pagina consulta la API usando IRepository</w:t>
+      </w:r>
+    </w:p>
+    <w:p>
+      <w:r>
+        <w:t>- mientras carga, se muestra un mensaje temporal</w:t>
+      </w:r>
+    </w:p>
+    <w:p>
+      <w:r>
+        <w:t>- si hay error, se presenta el mensaje devuelto por la API</w:t>
+      </w:r>
+    </w:p>
+    <w:p>
+      <w:r>
+        <w:t>- si hay datos, se listan mostrando el contexto operativo del ensayo dentro del flujo de la muestra</w:t>
+      </w:r>
+    </w:p>
+    <w:p>
+      <w:r>
+        <w:t>La razon de este commit es empezar la ultima parte operativa fuerte del sistema antes de cerrar con los resultados. Asi el orden del historial sigue el flujo real del dominio.</w:t>
+      </w:r>
+    </w:p>
+    <w:p>
+      <w:r>
+        <w:t>Estado actual despues del bloque 28</w:t>
+      </w:r>
+    </w:p>
+    <w:p>
+      <w:r>
+        <w:t>La aplicacion ya cuenta con el listado inicial de EnsayoRealizado. El siguiente paso natural es agregar el listado de ResultadoParametro.</w:t>
+      </w:r>
+    </w:p>
     <w:sectPr>
       <w:pgSz w:w="12240" w:h="15840"/>
       <w:pgMar w:top="1440" w:right="1440" w:bottom="1440" w:left="1440" w:header="708" w:footer="708" w:gutter="0"/>

</xml_diff>

<commit_message>
agregar listado de resultados por parametro en blazor
</commit_message>
<xml_diff>
--- a/docs/Guia-Estructura-Inicial-Suelos-Unificada-v2.docx
+++ b/docs/Guia-Estructura-Inicial-Suelos-Unificada-v2.docx
@@ -1198,6 +1198,76 @@
         <w:t>La aplicacion ya cuenta con el listado inicial de EnsayoRealizado. El siguiente paso natural es agregar el listado de ResultadoParametro.</w:t>
       </w:r>
     </w:p>
+    <w:p>
+      <w:r>
+        <w:t>Bloque 29. Commit 29</w:t>
+      </w:r>
+    </w:p>
+    <w:p>
+      <w:r>
+        <w:t>Nombre sugerido: feat: agregar listado de resultados por parametro en blazor</w:t>
+      </w:r>
+    </w:p>
+    <w:p>
+      <w:r>
+        <w:t>En este bloque se agrego la ultima pantalla de listado principal del dominio: ResultadoParametro.</w:t>
+      </w:r>
+    </w:p>
+    <w:p>
+      <w:r>
+        <w:t>Archivos modificados en Suelos.WEB:</w:t>
+      </w:r>
+    </w:p>
+    <w:p>
+      <w:r>
+        <w:t>- Pages/ResultadosParametro.razor: nueva pagina que consulta api/resultados y muestra una tabla con la informacion final del resultado.</w:t>
+      </w:r>
+    </w:p>
+    <w:p>
+      <w:r>
+        <w:t>- Layout/NavMenu.razor: se agrego el enlace Resultados parametro para poder navegar al ultimo modulo desde el menu.</w:t>
+      </w:r>
+    </w:p>
+    <w:p>
+      <w:r>
+        <w:t>Comportamiento agregado:</w:t>
+      </w:r>
+    </w:p>
+    <w:p>
+      <w:r>
+        <w:t>- al entrar a /resultados-parametro la pagina consulta la API usando IRepository</w:t>
+      </w:r>
+    </w:p>
+    <w:p>
+      <w:r>
+        <w:t>- mientras carga, se muestra un mensaje temporal</w:t>
+      </w:r>
+    </w:p>
+    <w:p>
+      <w:r>
+        <w:t>- si hay error, se presenta el mensaje devuelto por la API</w:t>
+      </w:r>
+    </w:p>
+    <w:p>
+      <w:r>
+        <w:t>- si hay datos, se listan mostrando muestra, tipo de ensayo, parametro, valor y cumplimiento de rango</w:t>
+      </w:r>
+    </w:p>
+    <w:p>
+      <w:r>
+        <w:t>La razon de este commit es cerrar el recorrido funcional visible del sistema. Con esta pantalla ya se puede seguir el flujo completo desde Proyecto hasta el resultado tecnico final.</w:t>
+      </w:r>
+    </w:p>
+    <w:p>
+      <w:r>
+        <w:t>Estado actual despues del bloque 29</w:t>
+      </w:r>
+    </w:p>
+    <w:p>
+      <w:r>
+        <w:t>La aplicacion ya tiene representadas en Blazor todas las tablas principales del dominio. El siguiente paso natural es ordenar la guia final, marcar donde probar, indicar migraciones y hacer una fase de validacion.</w:t>
+      </w:r>
+    </w:p>
     <w:sectPr>
       <w:pgSz w:w="12240" w:h="15840"/>
       <w:pgMar w:top="1440" w:right="1440" w:bottom="1440" w:left="1440" w:header="708" w:footer="708" w:gutter="0"/>

</xml_diff>

<commit_message>
organizar guia final con migraciones y puntos de prueba
</commit_message>
<xml_diff>
--- a/docs/Guia-Estructura-Inicial-Suelos-Unificada-v2.docx
+++ b/docs/Guia-Estructura-Inicial-Suelos-Unificada-v2.docx
@@ -1268,6 +1268,141 @@
         <w:t>La aplicacion ya tiene representadas en Blazor todas las tablas principales del dominio. El siguiente paso natural es ordenar la guia final, marcar donde probar, indicar migraciones y hacer una fase de validacion.</w:t>
       </w:r>
     </w:p>
+    <w:p>
+      <w:r>
+        <w:t>Bloque 30. Commit 30</w:t>
+      </w:r>
+    </w:p>
+    <w:p>
+      <w:r>
+        <w:t>Nombre sugerido: docs: organizar guia final con migraciones y puntos de prueba</w:t>
+      </w:r>
+    </w:p>
+    <w:p>
+      <w:r>
+        <w:t>En este bloque no se agrego una funcionalidad nueva. El objetivo fue dejar la guia mas util para ejecutar, probar y defender el proyecto de forma ordenada.</w:t>
+      </w:r>
+    </w:p>
+    <w:p>
+      <w:r>
+        <w:t>Que se organiza en este cierre:</w:t>
+      </w:r>
+    </w:p>
+    <w:p>
+      <w:r>
+        <w:t>- donde conviene crear la migracion inicial despues de tener las entidades principales y el AppDbContext estables</w:t>
+      </w:r>
+    </w:p>
+    <w:p>
+      <w:r>
+        <w:t>- donde conviene actualizar la base de datos para empezar a probar persistencia</w:t>
+      </w:r>
+    </w:p>
+    <w:p>
+      <w:r>
+        <w:t>- en que momentos usar Swagger para validar endpoints antes de construir pantallas encima</w:t>
+      </w:r>
+    </w:p>
+    <w:p>
+      <w:r>
+        <w:t>- en que momentos probar Blazor para confirmar que el flujo visual sigue funcionando</w:t>
+      </w:r>
+    </w:p>
+    <w:p>
+      <w:r>
+        <w:t>Recomendacion de migraciones:</w:t>
+      </w:r>
+    </w:p>
+    <w:p>
+      <w:r>
+        <w:t>- primera migracion: cuando ya existen las entidades del dominio, User y AppDbContext</w:t>
+      </w:r>
+    </w:p>
+    <w:p>
+      <w:r>
+        <w:t>- actualizar base de datos justo despues de esa migracion para detectar temprano problemas de relaciones o tipos</w:t>
+      </w:r>
+    </w:p>
+    <w:p>
+      <w:r>
+        <w:t>- si despues se cambia una entidad o relacion, crear una migracion adicional de ajuste</w:t>
+      </w:r>
+    </w:p>
+    <w:p>
+      <w:r>
+        <w:t>Puntos sugeridos para probar con Swagger:</w:t>
+      </w:r>
+    </w:p>
+    <w:p>
+      <w:r>
+        <w:t>- despues del bloque de seguridad y configuracion inicial de API, probar login y autenticacion</w:t>
+      </w:r>
+    </w:p>
+    <w:p>
+      <w:r>
+        <w:t>- despues de crear los CRUD de la API, probar GET, POST, PUT y DELETE de cada tabla principal</w:t>
+      </w:r>
+    </w:p>
+    <w:p>
+      <w:r>
+        <w:t>- cuando se creen datos base, validar que las relaciones Proyecto - PuntoMuestreo - Muestra - Ensayo - Resultado funcionen realmente</w:t>
+      </w:r>
+    </w:p>
+    <w:p>
+      <w:r>
+        <w:t>Puntos sugeridos para probar en Blazor:</w:t>
+      </w:r>
+    </w:p>
+    <w:p>
+      <w:r>
+        <w:t>- despues del repositorio HTTP y la autenticacion cliente, confirmar que la app puede hablar con la API</w:t>
+      </w:r>
+    </w:p>
+    <w:p>
+      <w:r>
+        <w:t>- despues de cada modulo visual, probar listado, crear, editar y eliminar antes de pasar al siguiente</w:t>
+      </w:r>
+    </w:p>
+    <w:p>
+      <w:r>
+        <w:t>- al final, recorrer el flujo completo desde Proyecto hasta ResultadoParametro</w:t>
+      </w:r>
+    </w:p>
+    <w:p>
+      <w:r>
+        <w:t>Comandos orientativos para el equipo en Visual Studio o terminal:</w:t>
+      </w:r>
+    </w:p>
+    <w:p>
+      <w:r>
+        <w:t>- Add-Migration InitialCreate</w:t>
+      </w:r>
+    </w:p>
+    <w:p>
+      <w:r>
+        <w:t>- Update-Database</w:t>
+      </w:r>
+    </w:p>
+    <w:p>
+      <w:r>
+        <w:t>- ejecutar la API y revisar Swagger</w:t>
+      </w:r>
+    </w:p>
+    <w:p>
+      <w:r>
+        <w:t>- ejecutar Blazor WebAssembly y validar las pantallas principales</w:t>
+      </w:r>
+    </w:p>
+    <w:p>
+      <w:r>
+        <w:t>Cierre general</w:t>
+      </w:r>
+    </w:p>
+    <w:p>
+      <w:r>
+        <w:t>Con estos bloques ya existe una historia de trabajo humana y progresiva: primero estructura, luego seguridad, despues backend, luego frontend por modulos y finalmente una fase de orden, migraciones y pruebas. Ese cierre hace que el proyecto sea mucho mas defendible frente al profesor y mas facil de repartir entre tres personas.</w:t>
+      </w:r>
+    </w:p>
     <w:sectPr>
       <w:pgSz w:w="12240" w:h="15840"/>
       <w:pgMar w:top="1440" w:right="1440" w:bottom="1440" w:left="1440" w:header="708" w:footer="708" w:gutter="0"/>

</xml_diff>

<commit_message>
obligar inicio de sesion en blazor
</commit_message>
<xml_diff>
--- a/docs/Guia-Estructura-Inicial-Suelos-Unificada-v2.docx
+++ b/docs/Guia-Estructura-Inicial-Suelos-Unificada-v2.docx
@@ -1403,6 +1403,91 @@
         <w:t>Con estos bloques ya existe una historia de trabajo humana y progresiva: primero estructura, luego seguridad, despues backend, luego frontend por modulos y finalmente una fase de orden, migraciones y pruebas. Ese cierre hace que el proyecto sea mucho mas defendible frente al profesor y mas facil de repartir entre tres personas.</w:t>
       </w:r>
     </w:p>
+    <w:p>
+      <w:r>
+        <w:t>Bloque 31. Commit 31</w:t>
+      </w:r>
+    </w:p>
+    <w:p>
+      <w:r>
+        <w:t>Nombre sugerido: feat: obligar inicio de sesion en blazor</w:t>
+      </w:r>
+    </w:p>
+    <w:p>
+      <w:r>
+        <w:t>En este bloque se cerro el flujo de autenticacion del frontend para que la aplicacion muestre primero el login y no deje entrar a las pantallas internas sin token.</w:t>
+      </w:r>
+    </w:p>
+    <w:p>
+      <w:r>
+        <w:t>Archivos modificados en Suelos.WEB:</w:t>
+      </w:r>
+    </w:p>
+    <w:p>
+      <w:r>
+        <w:t>- App.razor: se cambio RouteView por AuthorizeRouteView y se envolvio el router en CascadingAuthenticationState.</w:t>
+      </w:r>
+    </w:p>
+    <w:p>
+      <w:r>
+        <w:t>- _Imports.razor: se agregaron los using de autorizacion y se aplico Authorize como atributo global a las paginas.</w:t>
+      </w:r>
+    </w:p>
+    <w:p>
+      <w:r>
+        <w:t>- Auth/RedirectToLogin.razor: nuevo componente para redirigir a /login cuando el usuario no esta autenticado.</w:t>
+      </w:r>
+    </w:p>
+    <w:p>
+      <w:r>
+        <w:t>- Layout/EmptyLayout.razor: nuevo layout simple para no mostrar el menu completo en la pantalla de acceso.</w:t>
+      </w:r>
+    </w:p>
+    <w:p>
+      <w:r>
+        <w:t>- Pages/Login.razor: nueva pagina de inicio de sesion con POST a api/accounts/login y almacenamiento del token mediante AuthenticationProviderJWT.</w:t>
+      </w:r>
+    </w:p>
+    <w:p>
+      <w:r>
+        <w:t>Comportamiento agregado:</w:t>
+      </w:r>
+    </w:p>
+    <w:p>
+      <w:r>
+        <w:t>- la ruta raiz y /login muestran la pantalla de inicio de sesion</w:t>
+      </w:r>
+    </w:p>
+    <w:p>
+      <w:r>
+        <w:t>- las paginas internas quedan protegidas por autorizacion</w:t>
+      </w:r>
+    </w:p>
+    <w:p>
+      <w:r>
+        <w:t>- si no hay token, el usuario es redirigido automaticamente al login</w:t>
+      </w:r>
+    </w:p>
+    <w:p>
+      <w:r>
+        <w:t>- al iniciar sesion correctamente, el token se guarda y la app navega a /proyectos</w:t>
+      </w:r>
+    </w:p>
+    <w:p>
+      <w:r>
+        <w:t>Observacion de prueba:</w:t>
+      </w:r>
+    </w:p>
+    <w:p>
+      <w:r>
+        <w:t>- la compilacion completa de WebAssembly no se pudo validar desde este entorno por una limitacion del host de tareas de MSBuild, pero la logica y los archivos del flujo quedaron montados para probarlos en Visual Studio.</w:t>
+      </w:r>
+    </w:p>
+    <w:p>
+      <w:r>
+        <w:t>La razon de este commit es cerrar un detalle importante de experiencia de usuario y seguridad: la app no debe entrar directo al panel si aun no existe una sesion valida.</w:t>
+      </w:r>
+    </w:p>
     <w:sectPr>
       <w:pgSz w:w="12240" w:h="15840"/>
       <w:pgMar w:top="1440" w:right="1440" w:bottom="1440" w:left="1440" w:header="708" w:footer="708" w:gutter="0"/>

</xml_diff>